<commit_message>
Add interview citations and anonymized source index to EN report
- add_quote() helper: blockquoted paragraphs with left-border bar, italic
  text, and attribution line (role + interviewee code)
- Section 1 (Exec Summary): CEO quote I5 on economic gatekeeper
- Section 2.2 (Data & Req Mgmt): two PLM/silo quotes (I1, I11)
- Section 2.3 (Sales & Quotes): redesign-trap quotes (I19, I20)
- Section 2.4 (Sustainability): painful-process quote (I31)
- Section 3.2 (Customer Problems): two quotes per barrier block
  — Economic Gatekeeper (I4, I15), Data Desert (I1, I11),
    Redesign Trap (I19, I20), Tribal Knowledge (I25, I29)
- Section 3.3 (Strategic Fit): MD dev-cost quote (I36)
- Section 5 (Whitespace): one supporting quote per whitespace item
- Section 6 (NEW): Anonymized Interviewee Registry (I1–I44) and
  Industry Distribution table (16 sectors, %-share, role overview)

https://claude.ai/code/session_01HdND35A6hSCoirySL6NRe2
</commit_message>
<xml_diff>
--- a/260313_LFL_Competitor_Report_EN.docx
+++ b/260313_LFL_Competitor_Report_EN.docx
@@ -97,7 +97,7 @@
     </w:p>
     <w:p>
       <w:pPr>
-        <w:spacing w:before="0" w:after="100"/>
+        <w:spacing w:before="0" w:after="60"/>
       </w:pPr>
       <w:r>
         <w:rPr>
@@ -106,6 +106,38 @@
           <w:sz w:val="20"/>
         </w:rPr>
         <w:t>This Competitive Intelligence Report analyses the competitive landscape for LoopForgeLab — a Berlin-based deep-tech start-up building an AI-powered Product Intelligence Engine for mechanical product development. The database covers version 1.7 of the internal CI database, built on 44 qualitative expert interviews and systematic market research.</w:t>
+      </w:r>
+    </w:p>
+    <w:p>
+      <w:pPr>
+        <w:spacing w:before="80" w:after="20"/>
+        <w:ind w:left="454" w:right="283"/>
+        <w:pBdr>
+          <w:left w:val="single" w:sz="12" w:space="6" w:color="1A5F8A"/>
+        </w:pBdr>
+      </w:pPr>
+      <w:r>
+        <w:rPr>
+          <w:i/>
+          <w:color w:val="0D2B4A"/>
+          <w:sz w:val="18"/>
+        </w:rPr>
+        <w:t>"No one cares about sustainability unless it means money."</w:t>
+      </w:r>
+    </w:p>
+    <w:p>
+      <w:pPr>
+        <w:spacing w:before="0" w:after="100"/>
+        <w:ind w:left="454"/>
+        <w:jc w:val="left"/>
+      </w:pPr>
+      <w:r>
+        <w:rPr>
+          <w:i/>
+          <w:color w:val="00A8CC"/>
+          <w:sz w:val="16"/>
+        </w:rPr>
+        <w:t>— CEO, Electronics OEM  ·  I5 · LFL White Paper, Feb. 2026</w:t>
       </w:r>
     </w:p>
     <w:p>
@@ -1481,6 +1513,70 @@
     </w:p>
     <w:p>
       <w:pPr>
+        <w:spacing w:before="80" w:after="20"/>
+        <w:ind w:left="454" w:right="283"/>
+        <w:pBdr>
+          <w:left w:val="single" w:sz="12" w:space="6" w:color="1A5F8A"/>
+        </w:pBdr>
+      </w:pPr>
+      <w:r>
+        <w:rPr>
+          <w:i/>
+          <w:color w:val="0D2B4A"/>
+          <w:sz w:val="18"/>
+        </w:rPr>
+        <w:t>"Product data resides in multiple different enterprise applications… the silos don't work anymore."</w:t>
+      </w:r>
+    </w:p>
+    <w:p>
+      <w:pPr>
+        <w:spacing w:before="0" w:after="100"/>
+        <w:ind w:left="454"/>
+        <w:jc w:val="left"/>
+      </w:pPr>
+      <w:r>
+        <w:rPr>
+          <w:i/>
+          <w:color w:val="00A8CC"/>
+          <w:sz w:val="16"/>
+        </w:rPr>
+        <w:t>— Implementation Consultant, Engineering Software Consulting  ·  I1 · LFL White Paper, Feb. 2026</w:t>
+      </w:r>
+    </w:p>
+    <w:p>
+      <w:pPr>
+        <w:spacing w:before="80" w:after="20"/>
+        <w:ind w:left="454" w:right="283"/>
+        <w:pBdr>
+          <w:left w:val="single" w:sz="12" w:space="6" w:color="1A5F8A"/>
+        </w:pBdr>
+      </w:pPr>
+      <w:r>
+        <w:rPr>
+          <w:i/>
+          <w:color w:val="0D2B4A"/>
+          <w:sz w:val="18"/>
+        </w:rPr>
+        <w:t>"The tools could today already do much more than we use… we are still using plain Word and Excel."</w:t>
+      </w:r>
+    </w:p>
+    <w:p>
+      <w:pPr>
+        <w:spacing w:before="0" w:after="100"/>
+        <w:ind w:left="454"/>
+        <w:jc w:val="left"/>
+      </w:pPr>
+      <w:r>
+        <w:rPr>
+          <w:i/>
+          <w:color w:val="00A8CC"/>
+          <w:sz w:val="16"/>
+        </w:rPr>
+        <w:t>— Mechanical Engineer, Engineering Services  ·  I11 · LFL White Paper, Feb. 2026</w:t>
+      </w:r>
+    </w:p>
+    <w:p>
+      <w:pPr>
         <w:pStyle w:val="ListBullet"/>
         <w:spacing w:before="20" w:after="20"/>
       </w:pPr>
@@ -1534,6 +1630,70 @@
           <w:sz w:val="20"/>
         </w:rPr>
         <w:t>Sales &amp; Quotes is the category with the most direct relevance to LoopForgeLab's core solution. It covers solutions around quoting, procurement and supply chain: RfP/Bid-Response Management, e-Sourcing &amp; RfQ platforms, CPQ systems for complex products and supply chain planning. At 63% start-up share, the category is more balanced between large and small players. Despite comparatively fewer companies, the depth of problem-solving is high — and measurable customer pain is substantial.</w:t>
+      </w:r>
+    </w:p>
+    <w:p>
+      <w:pPr>
+        <w:spacing w:before="80" w:after="20"/>
+        <w:ind w:left="454" w:right="283"/>
+        <w:pBdr>
+          <w:left w:val="single" w:sz="12" w:space="6" w:color="1A5F8A"/>
+        </w:pBdr>
+      </w:pPr>
+      <w:r>
+        <w:rPr>
+          <w:i/>
+          <w:color w:val="0D2B4A"/>
+          <w:sz w:val="18"/>
+        </w:rPr>
+        <w:t>"Ideally, this was supposed to happen a lot earlier in our design phase… now we have to change this, and it's like, why haven't I got this information earlier?"</w:t>
+      </w:r>
+    </w:p>
+    <w:p>
+      <w:pPr>
+        <w:spacing w:before="0" w:after="100"/>
+        <w:ind w:left="454"/>
+        <w:jc w:val="left"/>
+      </w:pPr>
+      <w:r>
+        <w:rPr>
+          <w:i/>
+          <w:color w:val="00A8CC"/>
+          <w:sz w:val="16"/>
+        </w:rPr>
+        <w:t>— Senior Designer, Engineering Services  ·  I19 · LFL White Paper, Feb. 2026</w:t>
+      </w:r>
+    </w:p>
+    <w:p>
+      <w:pPr>
+        <w:spacing w:before="80" w:after="20"/>
+        <w:ind w:left="454" w:right="283"/>
+        <w:pBdr>
+          <w:left w:val="single" w:sz="12" w:space="6" w:color="1A5F8A"/>
+        </w:pBdr>
+      </w:pPr>
+      <w:r>
+        <w:rPr>
+          <w:i/>
+          <w:color w:val="0D2B4A"/>
+          <w:sz w:val="18"/>
+        </w:rPr>
+        <w:t>"Designers are often the last to know about the final price… there are sometimes surprises at the last stage."</w:t>
+      </w:r>
+    </w:p>
+    <w:p>
+      <w:pPr>
+        <w:spacing w:before="0" w:after="100"/>
+        <w:ind w:left="454"/>
+        <w:jc w:val="left"/>
+      </w:pPr>
+      <w:r>
+        <w:rPr>
+          <w:i/>
+          <w:color w:val="00A8CC"/>
+          <w:sz w:val="16"/>
+        </w:rPr>
+        <w:t>— Design Engineer, Automotive OEM  ·  I20 · LFL White Paper, Feb. 2026</w:t>
       </w:r>
     </w:p>
     <w:p>
@@ -1604,6 +1764,38 @@
           <w:sz w:val="20"/>
         </w:rPr>
         <w:t>The smallest category by company count but with the highest product density per company (avg. 2.2 products/company). Sustainability covers LCA software, CO₂ calculation tools, circular economy platforms and compliance solutions for CSRD/DPP requirements. With 92% start-up share, this is the most innovative and fastest-growing segment — driven by EU regulatory pressure. Only 2 established large companies (CarbonBright, Sphera) have gained a foothold so far.</w:t>
+      </w:r>
+    </w:p>
+    <w:p>
+      <w:pPr>
+        <w:spacing w:before="80" w:after="20"/>
+        <w:ind w:left="454" w:right="283"/>
+        <w:pBdr>
+          <w:left w:val="single" w:sz="12" w:space="6" w:color="1A5F8A"/>
+        </w:pBdr>
+      </w:pPr>
+      <w:r>
+        <w:rPr>
+          <w:i/>
+          <w:color w:val="0D2B4A"/>
+          <w:sz w:val="18"/>
+        </w:rPr>
+        <w:t>"It's a bit of a painful process… the board sends us back to recalculate, and it takes such a long time."</w:t>
+      </w:r>
+    </w:p>
+    <w:p>
+      <w:pPr>
+        <w:spacing w:before="0" w:after="100"/>
+        <w:ind w:left="454"/>
+        <w:jc w:val="left"/>
+      </w:pPr>
+      <w:r>
+        <w:rPr>
+          <w:i/>
+          <w:color w:val="00A8CC"/>
+          <w:sz w:val="16"/>
+        </w:rPr>
+        <w:t>— Sustainability Manager, Material Handling  ·  I31 · LFL White Paper, Feb. 2026</w:t>
       </w:r>
     </w:p>
     <w:p>
@@ -2214,6 +2406,70 @@
     </w:p>
     <w:p>
       <w:pPr>
+        <w:spacing w:before="80" w:after="20"/>
+        <w:ind w:left="454" w:right="283"/>
+        <w:pBdr>
+          <w:left w:val="single" w:sz="12" w:space="6" w:color="1A5F8A"/>
+        </w:pBdr>
+      </w:pPr>
+      <w:r>
+        <w:rPr>
+          <w:i/>
+          <w:color w:val="0D2B4A"/>
+          <w:sz w:val="18"/>
+        </w:rPr>
+        <w:t>"The price tag is the one thing that decides all and everything."</w:t>
+      </w:r>
+    </w:p>
+    <w:p>
+      <w:pPr>
+        <w:spacing w:before="0" w:after="100"/>
+        <w:ind w:left="454"/>
+        <w:jc w:val="left"/>
+      </w:pPr>
+      <w:r>
+        <w:rPr>
+          <w:i/>
+          <w:color w:val="00A8CC"/>
+          <w:sz w:val="16"/>
+        </w:rPr>
+        <w:t>— General Manager, Packaging OEM  ·  I4 · LFL White Paper, Feb. 2026</w:t>
+      </w:r>
+    </w:p>
+    <w:p>
+      <w:pPr>
+        <w:spacing w:before="80" w:after="20"/>
+        <w:ind w:left="454" w:right="283"/>
+        <w:pBdr>
+          <w:left w:val="single" w:sz="12" w:space="6" w:color="1A5F8A"/>
+        </w:pBdr>
+      </w:pPr>
+      <w:r>
+        <w:rPr>
+          <w:i/>
+          <w:color w:val="0D2B4A"/>
+          <w:sz w:val="18"/>
+        </w:rPr>
+        <w:t>"The primary question is always "what does it cost?" — everything else is secondary."</w:t>
+      </w:r>
+    </w:p>
+    <w:p>
+      <w:pPr>
+        <w:spacing w:before="0" w:after="100"/>
+        <w:ind w:left="454"/>
+        <w:jc w:val="left"/>
+      </w:pPr>
+      <w:r>
+        <w:rPr>
+          <w:i/>
+          <w:color w:val="00A8CC"/>
+          <w:sz w:val="16"/>
+        </w:rPr>
+        <w:t>— Senior Director of Strategy, Consulting  ·  I15 · LFL White Paper, Feb. 2026</w:t>
+      </w:r>
+    </w:p>
+    <w:p>
+      <w:pPr>
         <w:spacing w:before="100" w:after="20"/>
       </w:pPr>
       <w:r>
@@ -2236,6 +2492,70 @@
           <w:sz w:val="20"/>
         </w:rPr>
         <w:t>Critical product data — CO₂ footprints, supplier prices, manufacturing constraints — are scattered across PLM, ERP, Excel and local documents. The result: RfP teams rewrite 30–40% of all responses from scratch even though the information exists somewhere in the organisation. The Loopio benchmark measures 17+ hours per RfP response.</w:t>
+      </w:r>
+    </w:p>
+    <w:p>
+      <w:pPr>
+        <w:spacing w:before="80" w:after="20"/>
+        <w:ind w:left="454" w:right="283"/>
+        <w:pBdr>
+          <w:left w:val="single" w:sz="12" w:space="6" w:color="1A5F8A"/>
+        </w:pBdr>
+      </w:pPr>
+      <w:r>
+        <w:rPr>
+          <w:i/>
+          <w:color w:val="0D2B4A"/>
+          <w:sz w:val="18"/>
+        </w:rPr>
+        <w:t>"Product data resides in multiple different enterprise applications… the silos don't work anymore."</w:t>
+      </w:r>
+    </w:p>
+    <w:p>
+      <w:pPr>
+        <w:spacing w:before="0" w:after="100"/>
+        <w:ind w:left="454"/>
+        <w:jc w:val="left"/>
+      </w:pPr>
+      <w:r>
+        <w:rPr>
+          <w:i/>
+          <w:color w:val="00A8CC"/>
+          <w:sz w:val="16"/>
+        </w:rPr>
+        <w:t>— Implementation Consultant, Engineering Software Consulting  ·  I1 · LFL White Paper, Feb. 2026</w:t>
+      </w:r>
+    </w:p>
+    <w:p>
+      <w:pPr>
+        <w:spacing w:before="80" w:after="20"/>
+        <w:ind w:left="454" w:right="283"/>
+        <w:pBdr>
+          <w:left w:val="single" w:sz="12" w:space="6" w:color="1A5F8A"/>
+        </w:pBdr>
+      </w:pPr>
+      <w:r>
+        <w:rPr>
+          <w:i/>
+          <w:color w:val="0D2B4A"/>
+          <w:sz w:val="18"/>
+        </w:rPr>
+        <w:t>"We are still using plain Word and Excel for high-stakes decision-making."</w:t>
+      </w:r>
+    </w:p>
+    <w:p>
+      <w:pPr>
+        <w:spacing w:before="0" w:after="100"/>
+        <w:ind w:left="454"/>
+        <w:jc w:val="left"/>
+      </w:pPr>
+      <w:r>
+        <w:rPr>
+          <w:i/>
+          <w:color w:val="00A8CC"/>
+          <w:sz w:val="16"/>
+        </w:rPr>
+        <w:t>— Mechanical Engineer, Engineering Services  ·  I11 · LFL White Paper, Feb. 2026</w:t>
       </w:r>
     </w:p>
     <w:p>
@@ -2266,6 +2586,70 @@
     </w:p>
     <w:p>
       <w:pPr>
+        <w:spacing w:before="80" w:after="20"/>
+        <w:ind w:left="454" w:right="283"/>
+        <w:pBdr>
+          <w:left w:val="single" w:sz="12" w:space="6" w:color="1A5F8A"/>
+        </w:pBdr>
+      </w:pPr>
+      <w:r>
+        <w:rPr>
+          <w:i/>
+          <w:color w:val="0D2B4A"/>
+          <w:sz w:val="18"/>
+        </w:rPr>
+        <w:t>"Ideally, this was supposed to happen a lot earlier in our design phase… why haven't I got this information earlier?"</w:t>
+      </w:r>
+    </w:p>
+    <w:p>
+      <w:pPr>
+        <w:spacing w:before="0" w:after="100"/>
+        <w:ind w:left="454"/>
+        <w:jc w:val="left"/>
+      </w:pPr>
+      <w:r>
+        <w:rPr>
+          <w:i/>
+          <w:color w:val="00A8CC"/>
+          <w:sz w:val="16"/>
+        </w:rPr>
+        <w:t>— Senior Designer, Engineering Services  ·  I19 · LFL White Paper, Feb. 2026</w:t>
+      </w:r>
+    </w:p>
+    <w:p>
+      <w:pPr>
+        <w:spacing w:before="80" w:after="20"/>
+        <w:ind w:left="454" w:right="283"/>
+        <w:pBdr>
+          <w:left w:val="single" w:sz="12" w:space="6" w:color="1A5F8A"/>
+        </w:pBdr>
+      </w:pPr>
+      <w:r>
+        <w:rPr>
+          <w:i/>
+          <w:color w:val="0D2B4A"/>
+          <w:sz w:val="18"/>
+        </w:rPr>
+        <w:t>"Designers are often the last to know about the final price… there are sometimes surprises at the last stage."</w:t>
+      </w:r>
+    </w:p>
+    <w:p>
+      <w:pPr>
+        <w:spacing w:before="0" w:after="100"/>
+        <w:ind w:left="454"/>
+        <w:jc w:val="left"/>
+      </w:pPr>
+      <w:r>
+        <w:rPr>
+          <w:i/>
+          <w:color w:val="00A8CC"/>
+          <w:sz w:val="16"/>
+        </w:rPr>
+        <w:t>— Design Engineer, Automotive OEM  ·  I20 · LFL White Paper, Feb. 2026</w:t>
+      </w:r>
+    </w:p>
+    <w:p>
+      <w:pPr>
         <w:spacing w:before="100" w:after="20"/>
       </w:pPr>
       <w:r>
@@ -2288,6 +2672,70 @@
           <w:sz w:val="20"/>
         </w:rPr>
         <w:t>When experienced engineers retire, the implicit knowledge of why certain configurations work — or why certain suppliers are preferred — disappears. CPQ systems can only scale this knowledge if it is explicitly codified. Today, that codification largely does not exist.</w:t>
+      </w:r>
+    </w:p>
+    <w:p>
+      <w:pPr>
+        <w:spacing w:before="80" w:after="20"/>
+        <w:ind w:left="454" w:right="283"/>
+        <w:pBdr>
+          <w:left w:val="single" w:sz="12" w:space="6" w:color="1A5F8A"/>
+        </w:pBdr>
+      </w:pPr>
+      <w:r>
+        <w:rPr>
+          <w:i/>
+          <w:color w:val="0D2B4A"/>
+          <w:sz w:val="18"/>
+        </w:rPr>
+        <w:t>"I call it Tribal-Knowledge. That is just with a few people — they know it all."</w:t>
+      </w:r>
+    </w:p>
+    <w:p>
+      <w:pPr>
+        <w:spacing w:before="0" w:after="100"/>
+        <w:ind w:left="454"/>
+        <w:jc w:val="left"/>
+      </w:pPr>
+      <w:r>
+        <w:rPr>
+          <w:i/>
+          <w:color w:val="00A8CC"/>
+          <w:sz w:val="16"/>
+        </w:rPr>
+        <w:t>— Product Development Team Lead, Automotive OEM  ·  I25 · LFL White Paper, Feb. 2026</w:t>
+      </w:r>
+    </w:p>
+    <w:p>
+      <w:pPr>
+        <w:spacing w:before="80" w:after="20"/>
+        <w:ind w:left="454" w:right="283"/>
+        <w:pBdr>
+          <w:left w:val="single" w:sz="12" w:space="6" w:color="1A5F8A"/>
+        </w:pBdr>
+      </w:pPr>
+      <w:r>
+        <w:rPr>
+          <w:i/>
+          <w:color w:val="0D2B4A"/>
+          <w:sz w:val="18"/>
+        </w:rPr>
+        <w:t>"The junior doesn't know it all… the decision whether to go left or right is usually not possible with his background."</w:t>
+      </w:r>
+    </w:p>
+    <w:p>
+      <w:pPr>
+        <w:spacing w:before="0" w:after="100"/>
+        <w:ind w:left="454"/>
+        <w:jc w:val="left"/>
+      </w:pPr>
+      <w:r>
+        <w:rPr>
+          <w:i/>
+          <w:color w:val="00A8CC"/>
+          <w:sz w:val="16"/>
+        </w:rPr>
+        <w:t>— Expert Interviewee, Automotive OEM  ·  I29 · LFL White Paper, Feb. 2026</w:t>
       </w:r>
     </w:p>
     <w:p>
@@ -3562,6 +4010,38 @@
     </w:p>
     <w:p>
       <w:pPr>
+        <w:spacing w:before="80" w:after="20"/>
+        <w:ind w:left="454" w:right="283"/>
+        <w:pBdr>
+          <w:left w:val="single" w:sz="12" w:space="6" w:color="1A5F8A"/>
+        </w:pBdr>
+      </w:pPr>
+      <w:r>
+        <w:rPr>
+          <w:i/>
+          <w:color w:val="0D2B4A"/>
+          <w:sz w:val="18"/>
+        </w:rPr>
+        <w:t>"If I really want to develop something new, it takes four years… and lower seven-digit development costs."</w:t>
+      </w:r>
+    </w:p>
+    <w:p>
+      <w:pPr>
+        <w:spacing w:before="0" w:after="100"/>
+        <w:ind w:left="454"/>
+        <w:jc w:val="left"/>
+      </w:pPr>
+      <w:r>
+        <w:rPr>
+          <w:i/>
+          <w:color w:val="00A8CC"/>
+          <w:sz w:val="16"/>
+        </w:rPr>
+        <w:t>— CEO, Manufacturing Machinery  ·  I36 · LFL White Paper, Feb. 2026</w:t>
+      </w:r>
+    </w:p>
+    <w:p>
+      <w:pPr>
         <w:spacing w:before="0" w:after="40"/>
       </w:pPr>
       <w:r>
@@ -6416,7 +6896,7 @@
     </w:p>
     <w:p>
       <w:pPr>
-        <w:spacing w:before="0" w:after="60"/>
+        <w:spacing w:before="0" w:after="40"/>
       </w:pPr>
       <w:r>
         <w:rPr>
@@ -6425,6 +6905,38 @@
           <w:sz w:val="20"/>
         </w:rPr>
         <w:t>All existing CPQ and e-sourcing solutions start after the design process. No solution anchors quote calculation natively in the CAD-based engineering workflow. Tacton and DriveWorks come closest, but are not positioned as "Engineering-First" tools. LFL closes this gap with its Product Intelligence Engine — cost, compliance and CO₂ become native design parameters, not downstream calculations.</w:t>
+      </w:r>
+    </w:p>
+    <w:p>
+      <w:pPr>
+        <w:spacing w:before="80" w:after="20"/>
+        <w:ind w:left="454" w:right="283"/>
+        <w:pBdr>
+          <w:left w:val="single" w:sz="12" w:space="6" w:color="1A5F8A"/>
+        </w:pBdr>
+      </w:pPr>
+      <w:r>
+        <w:rPr>
+          <w:i/>
+          <w:color w:val="0D2B4A"/>
+          <w:sz w:val="18"/>
+        </w:rPr>
+        <w:t>"Ideally, this was supposed to happen a lot earlier in our design phase… why haven't I got this information earlier?"</w:t>
+      </w:r>
+    </w:p>
+    <w:p>
+      <w:pPr>
+        <w:spacing w:before="0" w:after="100"/>
+        <w:ind w:left="454"/>
+        <w:jc w:val="left"/>
+      </w:pPr>
+      <w:r>
+        <w:rPr>
+          <w:i/>
+          <w:color w:val="00A8CC"/>
+          <w:sz w:val="16"/>
+        </w:rPr>
+        <w:t>— Senior Designer, Engineering Services  ·  I19 · LFL White Paper, Feb. 2026</w:t>
       </w:r>
     </w:p>
     <w:p>
@@ -6442,7 +6954,7 @@
     </w:p>
     <w:p>
       <w:pPr>
-        <w:spacing w:before="0" w:after="60"/>
+        <w:spacing w:before="0" w:after="40"/>
       </w:pPr>
       <w:r>
         <w:rPr>
@@ -6451,6 +6963,38 @@
           <w:sz w:val="20"/>
         </w:rPr>
         <w:t>The three CPQ providers (Tacton, DriveWorks, Elfsquad) are either enterprise-only or SolidWorks-exclusive. For the European mid-market (mechanical engineering, material handling), there is no affordable, CAD-agnostic CPQ solution for true ETO products. LFL's target segment (OEM &gt;30 employees in DACH/Benelux) is precisely this gap.</w:t>
+      </w:r>
+    </w:p>
+    <w:p>
+      <w:pPr>
+        <w:spacing w:before="80" w:after="20"/>
+        <w:ind w:left="454" w:right="283"/>
+        <w:pBdr>
+          <w:left w:val="single" w:sz="12" w:space="6" w:color="1A5F8A"/>
+        </w:pBdr>
+      </w:pPr>
+      <w:r>
+        <w:rPr>
+          <w:i/>
+          <w:color w:val="0D2B4A"/>
+          <w:sz w:val="18"/>
+        </w:rPr>
+        <w:t>"If I really want to develop something new, it takes four years… and lower seven-digit development costs."</w:t>
+      </w:r>
+    </w:p>
+    <w:p>
+      <w:pPr>
+        <w:spacing w:before="0" w:after="100"/>
+        <w:ind w:left="454"/>
+        <w:jc w:val="left"/>
+      </w:pPr>
+      <w:r>
+        <w:rPr>
+          <w:i/>
+          <w:color w:val="00A8CC"/>
+          <w:sz w:val="16"/>
+        </w:rPr>
+        <w:t>— CEO, Manufacturing Machinery  ·  I36 · LFL White Paper, Feb. 2026</w:t>
       </w:r>
     </w:p>
     <w:p>
@@ -6468,7 +7012,7 @@
     </w:p>
     <w:p>
       <w:pPr>
-        <w:spacing w:before="0" w:after="60"/>
+        <w:spacing w:before="0" w:after="40"/>
       </w:pPr>
       <w:r>
         <w:rPr>
@@ -6477,6 +7021,38 @@
           <w:sz w:val="20"/>
         </w:rPr>
         <w:t>Only Tacton has begun integrating a CO₂ calculator into CPQ. The combination of real-time cost calculation, CO₂ feedback and quote generation in an engineer-centric interface does not yet exist. LFL's "Carbon Case" (up to 10.5M tCO₂e savings in year 10 at 14% market share) positions this integration as a strategic differentiator.</w:t>
+      </w:r>
+    </w:p>
+    <w:p>
+      <w:pPr>
+        <w:spacing w:before="80" w:after="20"/>
+        <w:ind w:left="454" w:right="283"/>
+        <w:pBdr>
+          <w:left w:val="single" w:sz="12" w:space="6" w:color="1A5F8A"/>
+        </w:pBdr>
+      </w:pPr>
+      <w:r>
+        <w:rPr>
+          <w:i/>
+          <w:color w:val="0D2B4A"/>
+          <w:sz w:val="18"/>
+        </w:rPr>
+        <w:t>"It's a bit of a painful process… the board sends us back to recalculate, and it takes such a long time."</w:t>
+      </w:r>
+    </w:p>
+    <w:p>
+      <w:pPr>
+        <w:spacing w:before="0" w:after="100"/>
+        <w:ind w:left="454"/>
+        <w:jc w:val="left"/>
+      </w:pPr>
+      <w:r>
+        <w:rPr>
+          <w:i/>
+          <w:color w:val="00A8CC"/>
+          <w:sz w:val="16"/>
+        </w:rPr>
+        <w:t>— Sustainability Manager, Material Handling  ·  I31 · LFL White Paper, Feb. 2026</w:t>
       </w:r>
     </w:p>
     <w:p>
@@ -6494,7 +7070,7 @@
     </w:p>
     <w:p>
       <w:pPr>
-        <w:spacing w:before="0" w:after="60"/>
+        <w:spacing w:before="0" w:after="40"/>
       </w:pPr>
       <w:r>
         <w:rPr>
@@ -6503,6 +7079,38 @@
           <w:sz w:val="20"/>
         </w:rPr>
         <w:t>No provider in the Sales &amp; Quotes category explicitly addresses the codification of institutional engineering knowledge. LFL's "Operator Insights" module (repairability, circular economy) and Design Copilot approach create scalable digital knowledge infrastructure — a genuine whitespace.</w:t>
+      </w:r>
+    </w:p>
+    <w:p>
+      <w:pPr>
+        <w:spacing w:before="80" w:after="20"/>
+        <w:ind w:left="454" w:right="283"/>
+        <w:pBdr>
+          <w:left w:val="single" w:sz="12" w:space="6" w:color="1A5F8A"/>
+        </w:pBdr>
+      </w:pPr>
+      <w:r>
+        <w:rPr>
+          <w:i/>
+          <w:color w:val="0D2B4A"/>
+          <w:sz w:val="18"/>
+        </w:rPr>
+        <w:t>"I call it Tribal-Knowledge. That is just with a few people — they know it all."</w:t>
+      </w:r>
+    </w:p>
+    <w:p>
+      <w:pPr>
+        <w:spacing w:before="0" w:after="100"/>
+        <w:ind w:left="454"/>
+        <w:jc w:val="left"/>
+      </w:pPr>
+      <w:r>
+        <w:rPr>
+          <w:i/>
+          <w:color w:val="00A8CC"/>
+          <w:sz w:val="16"/>
+        </w:rPr>
+        <w:t>— Product Development Team Lead, Automotive OEM  ·  I25 · LFL White Paper, Feb. 2026</w:t>
       </w:r>
     </w:p>
     <w:p>
@@ -6539,6 +7147,3959 @@
           <w:sz w:val="15"/>
         </w:rPr>
         <w:t>Sources: All market data from Competitive Intelligence Database v1.7 (13 March 2026). Qualitative insights from LoopForgeLab White Paper (February 2026, 44 expert interviews) and LoopForgeLab Pitch Deck (March 2026). External benchmarks: Loopio RfP Benchmark Report; Resilinc Supply Chain Disruption Study 2023; DriveWorks Engineering Change Studies; McKinsey Supply Chain Disruption Cost Analysis 2023; Center for Automotive Research 2026; EU Commission CSRD Regulation.</w:t>
+      </w:r>
+    </w:p>
+    <w:p>
+      <w:r>
+        <w:br w:type="page"/>
+      </w:r>
+    </w:p>
+    <w:p>
+      <w:pPr>
+        <w:pStyle w:val="Heading1"/>
+        <w:spacing w:before="200" w:after="80"/>
+      </w:pPr>
+      <w:r>
+        <w:rPr>
+          <w:color w:val="0D2B4A"/>
+          <w:sz w:val="28"/>
+        </w:rPr>
+        <w:t>6  Anonymized Interviewee Source Index</w:t>
+      </w:r>
+    </w:p>
+    <w:p>
+      <w:pPr>
+        <w:spacing w:before="0" w:after="100"/>
+      </w:pPr>
+      <w:r>
+        <w:rPr>
+          <w:b w:val="0"/>
+          <w:color w:val="1A1A2E"/>
+          <w:sz w:val="20"/>
+        </w:rPr>
+        <w:t>The qualitative insights cited throughout this report are drawn from 44 expert interviews conducted by LoopForgeLab between Q4 2025 and Q1 2026 as part of the White Paper research ("Optimized for Performance, Approved for Price", February 2026). All interviewees are anonymized. The codes I1–I44 used as citations refer to the entries in the table below. Company names are not disclosed; interviewees are identified solely by role category and industry.</w:t>
+      </w:r>
+    </w:p>
+    <w:p>
+      <w:pPr>
+        <w:pStyle w:val="Heading2"/>
+        <w:spacing w:before="160" w:after="60"/>
+      </w:pPr>
+      <w:r>
+        <w:rPr>
+          <w:color w:val="1A5F8A"/>
+          <w:sz w:val="22"/>
+        </w:rPr>
+        <w:t>6.1  Anonymized Interviewee Registry  (I1 – I44)</w:t>
+      </w:r>
+    </w:p>
+    <w:tbl>
+      <w:tblPr>
+        <w:tblStyle w:val="TableGrid"/>
+        <w:tblW w:type="auto" w:w="0"/>
+        <w:jc w:val="center"/>
+        <w:tblLook w:firstColumn="1" w:firstRow="1" w:lastColumn="0" w:lastRow="0" w:noHBand="0" w:noVBand="1" w:val="04A0"/>
+      </w:tblPr>
+      <w:tblGrid>
+        <w:gridCol w:w="3173"/>
+        <w:gridCol w:w="3173"/>
+        <w:gridCol w:w="3173"/>
+      </w:tblGrid>
+      <w:tr>
+        <w:tc>
+          <w:tcPr>
+            <w:tcW w:type="dxa" w:w="794"/>
+            <w:shd w:val="clear" w:color="auto" w:fill="1A5F8A"/>
+          </w:tcPr>
+          <w:p>
+            <w:pPr>
+              <w:jc w:val="center"/>
+            </w:pPr>
+            <w:r>
+              <w:rPr>
+                <w:b/>
+                <w:color w:val="FFFFFF"/>
+                <w:sz w:val="16"/>
+              </w:rPr>
+              <w:t>Code</w:t>
+            </w:r>
+          </w:p>
+        </w:tc>
+        <w:tc>
+          <w:tcPr>
+            <w:tcW w:type="dxa" w:w="4195"/>
+            <w:shd w:val="clear" w:color="auto" w:fill="1A5F8A"/>
+          </w:tcPr>
+          <w:p>
+            <w:pPr>
+              <w:jc w:val="center"/>
+            </w:pPr>
+            <w:r>
+              <w:rPr>
+                <w:b/>
+                <w:color w:val="FFFFFF"/>
+                <w:sz w:val="16"/>
+              </w:rPr>
+              <w:t>Anonymized Role</w:t>
+            </w:r>
+          </w:p>
+        </w:tc>
+        <w:tc>
+          <w:tcPr>
+            <w:tcW w:type="dxa" w:w="4819"/>
+            <w:shd w:val="clear" w:color="auto" w:fill="1A5F8A"/>
+          </w:tcPr>
+          <w:p>
+            <w:pPr>
+              <w:jc w:val="center"/>
+            </w:pPr>
+            <w:r>
+              <w:rPr>
+                <w:b/>
+                <w:color w:val="FFFFFF"/>
+                <w:sz w:val="16"/>
+              </w:rPr>
+              <w:t>Industry Sector</w:t>
+            </w:r>
+          </w:p>
+        </w:tc>
+      </w:tr>
+      <w:tr>
+        <w:tc>
+          <w:tcPr>
+            <w:tcW w:type="dxa" w:w="3173"/>
+            <w:shd w:val="clear" w:color="auto" w:fill="FFFFFF"/>
+          </w:tcPr>
+          <w:p>
+            <w:pPr>
+              <w:jc w:val="center"/>
+            </w:pPr>
+            <w:r>
+              <w:rPr>
+                <w:b/>
+                <w:color w:val="00A8CC"/>
+                <w:sz w:val="16"/>
+              </w:rPr>
+              <w:t>I1</w:t>
+            </w:r>
+          </w:p>
+        </w:tc>
+        <w:tc>
+          <w:tcPr>
+            <w:tcW w:type="dxa" w:w="3173"/>
+            <w:shd w:val="clear" w:color="auto" w:fill="FFFFFF"/>
+          </w:tcPr>
+          <w:p>
+            <w:r>
+              <w:rPr>
+                <w:b w:val="0"/>
+                <w:sz w:val="16"/>
+              </w:rPr>
+              <w:t>Implementation Consultant, Co-Founder</w:t>
+            </w:r>
+          </w:p>
+        </w:tc>
+        <w:tc>
+          <w:tcPr>
+            <w:tcW w:type="dxa" w:w="3173"/>
+            <w:shd w:val="clear" w:color="auto" w:fill="FFFFFF"/>
+          </w:tcPr>
+          <w:p>
+            <w:r>
+              <w:rPr>
+                <w:b w:val="0"/>
+                <w:sz w:val="16"/>
+              </w:rPr>
+              <w:t>Engineering Software Consulting</w:t>
+            </w:r>
+          </w:p>
+        </w:tc>
+      </w:tr>
+      <w:tr>
+        <w:tc>
+          <w:tcPr>
+            <w:tcW w:type="dxa" w:w="3173"/>
+            <w:shd w:val="clear" w:color="auto" w:fill="F2F5F8"/>
+          </w:tcPr>
+          <w:p>
+            <w:pPr>
+              <w:jc w:val="center"/>
+            </w:pPr>
+            <w:r>
+              <w:rPr>
+                <w:b/>
+                <w:color w:val="00A8CC"/>
+                <w:sz w:val="16"/>
+              </w:rPr>
+              <w:t>I2</w:t>
+            </w:r>
+          </w:p>
+        </w:tc>
+        <w:tc>
+          <w:tcPr>
+            <w:tcW w:type="dxa" w:w="3173"/>
+            <w:shd w:val="clear" w:color="auto" w:fill="F2F5F8"/>
+          </w:tcPr>
+          <w:p>
+            <w:r>
+              <w:rPr>
+                <w:b w:val="0"/>
+                <w:sz w:val="16"/>
+              </w:rPr>
+              <w:t>Implementation Consultant, Co-Founder</w:t>
+            </w:r>
+          </w:p>
+        </w:tc>
+        <w:tc>
+          <w:tcPr>
+            <w:tcW w:type="dxa" w:w="3173"/>
+            <w:shd w:val="clear" w:color="auto" w:fill="F2F5F8"/>
+          </w:tcPr>
+          <w:p>
+            <w:r>
+              <w:rPr>
+                <w:b w:val="0"/>
+                <w:sz w:val="16"/>
+              </w:rPr>
+              <w:t>Engineering Software Consulting</w:t>
+            </w:r>
+          </w:p>
+        </w:tc>
+      </w:tr>
+      <w:tr>
+        <w:tc>
+          <w:tcPr>
+            <w:tcW w:type="dxa" w:w="3173"/>
+            <w:shd w:val="clear" w:color="auto" w:fill="FFFFFF"/>
+          </w:tcPr>
+          <w:p>
+            <w:pPr>
+              <w:jc w:val="center"/>
+            </w:pPr>
+            <w:r>
+              <w:rPr>
+                <w:b/>
+                <w:color w:val="00A8CC"/>
+                <w:sz w:val="16"/>
+              </w:rPr>
+              <w:t>I3</w:t>
+            </w:r>
+          </w:p>
+        </w:tc>
+        <w:tc>
+          <w:tcPr>
+            <w:tcW w:type="dxa" w:w="3173"/>
+            <w:shd w:val="clear" w:color="auto" w:fill="FFFFFF"/>
+          </w:tcPr>
+          <w:p>
+            <w:r>
+              <w:rPr>
+                <w:b w:val="0"/>
+                <w:sz w:val="16"/>
+              </w:rPr>
+              <w:t>Head of Brand &amp; Design, Founder</w:t>
+            </w:r>
+          </w:p>
+        </w:tc>
+        <w:tc>
+          <w:tcPr>
+            <w:tcW w:type="dxa" w:w="3173"/>
+            <w:shd w:val="clear" w:color="auto" w:fill="FFFFFF"/>
+          </w:tcPr>
+          <w:p>
+            <w:r>
+              <w:rPr>
+                <w:b w:val="0"/>
+                <w:sz w:val="16"/>
+              </w:rPr>
+              <w:t>Engineering Services</w:t>
+            </w:r>
+          </w:p>
+        </w:tc>
+      </w:tr>
+      <w:tr>
+        <w:tc>
+          <w:tcPr>
+            <w:tcW w:type="dxa" w:w="3173"/>
+            <w:shd w:val="clear" w:color="auto" w:fill="F2F5F8"/>
+          </w:tcPr>
+          <w:p>
+            <w:pPr>
+              <w:jc w:val="center"/>
+            </w:pPr>
+            <w:r>
+              <w:rPr>
+                <w:b/>
+                <w:color w:val="00A8CC"/>
+                <w:sz w:val="16"/>
+              </w:rPr>
+              <w:t>I4</w:t>
+            </w:r>
+          </w:p>
+        </w:tc>
+        <w:tc>
+          <w:tcPr>
+            <w:tcW w:type="dxa" w:w="3173"/>
+            <w:shd w:val="clear" w:color="auto" w:fill="F2F5F8"/>
+          </w:tcPr>
+          <w:p>
+            <w:r>
+              <w:rPr>
+                <w:b w:val="0"/>
+                <w:sz w:val="16"/>
+              </w:rPr>
+              <w:t>General Manager</w:t>
+            </w:r>
+          </w:p>
+        </w:tc>
+        <w:tc>
+          <w:tcPr>
+            <w:tcW w:type="dxa" w:w="3173"/>
+            <w:shd w:val="clear" w:color="auto" w:fill="F2F5F8"/>
+          </w:tcPr>
+          <w:p>
+            <w:r>
+              <w:rPr>
+                <w:b w:val="0"/>
+                <w:sz w:val="16"/>
+              </w:rPr>
+              <w:t>Packaging</w:t>
+            </w:r>
+          </w:p>
+        </w:tc>
+      </w:tr>
+      <w:tr>
+        <w:tc>
+          <w:tcPr>
+            <w:tcW w:type="dxa" w:w="3173"/>
+            <w:shd w:val="clear" w:color="auto" w:fill="FFFFFF"/>
+          </w:tcPr>
+          <w:p>
+            <w:pPr>
+              <w:jc w:val="center"/>
+            </w:pPr>
+            <w:r>
+              <w:rPr>
+                <w:b/>
+                <w:color w:val="00A8CC"/>
+                <w:sz w:val="16"/>
+              </w:rPr>
+              <w:t>I5</w:t>
+            </w:r>
+          </w:p>
+        </w:tc>
+        <w:tc>
+          <w:tcPr>
+            <w:tcW w:type="dxa" w:w="3173"/>
+            <w:shd w:val="clear" w:color="auto" w:fill="FFFFFF"/>
+          </w:tcPr>
+          <w:p>
+            <w:r>
+              <w:rPr>
+                <w:b w:val="0"/>
+                <w:sz w:val="16"/>
+              </w:rPr>
+              <w:t>CEO</w:t>
+            </w:r>
+          </w:p>
+        </w:tc>
+        <w:tc>
+          <w:tcPr>
+            <w:tcW w:type="dxa" w:w="3173"/>
+            <w:shd w:val="clear" w:color="auto" w:fill="FFFFFF"/>
+          </w:tcPr>
+          <w:p>
+            <w:r>
+              <w:rPr>
+                <w:b w:val="0"/>
+                <w:sz w:val="16"/>
+              </w:rPr>
+              <w:t>Electronics OEM</w:t>
+            </w:r>
+          </w:p>
+        </w:tc>
+      </w:tr>
+      <w:tr>
+        <w:tc>
+          <w:tcPr>
+            <w:tcW w:type="dxa" w:w="3173"/>
+            <w:shd w:val="clear" w:color="auto" w:fill="F2F5F8"/>
+          </w:tcPr>
+          <w:p>
+            <w:pPr>
+              <w:jc w:val="center"/>
+            </w:pPr>
+            <w:r>
+              <w:rPr>
+                <w:b/>
+                <w:color w:val="00A8CC"/>
+                <w:sz w:val="16"/>
+              </w:rPr>
+              <w:t>I6</w:t>
+            </w:r>
+          </w:p>
+        </w:tc>
+        <w:tc>
+          <w:tcPr>
+            <w:tcW w:type="dxa" w:w="3173"/>
+            <w:shd w:val="clear" w:color="auto" w:fill="F2F5F8"/>
+          </w:tcPr>
+          <w:p>
+            <w:r>
+              <w:rPr>
+                <w:b w:val="0"/>
+                <w:sz w:val="16"/>
+              </w:rPr>
+              <w:t>Business Developer, Co-Founder</w:t>
+            </w:r>
+          </w:p>
+        </w:tc>
+        <w:tc>
+          <w:tcPr>
+            <w:tcW w:type="dxa" w:w="3173"/>
+            <w:shd w:val="clear" w:color="auto" w:fill="F2F5F8"/>
+          </w:tcPr>
+          <w:p>
+            <w:r>
+              <w:rPr>
+                <w:b w:val="0"/>
+                <w:sz w:val="16"/>
+              </w:rPr>
+              <w:t>Production Software</w:t>
+            </w:r>
+          </w:p>
+        </w:tc>
+      </w:tr>
+      <w:tr>
+        <w:tc>
+          <w:tcPr>
+            <w:tcW w:type="dxa" w:w="3173"/>
+            <w:shd w:val="clear" w:color="auto" w:fill="FFFFFF"/>
+          </w:tcPr>
+          <w:p>
+            <w:pPr>
+              <w:jc w:val="center"/>
+            </w:pPr>
+            <w:r>
+              <w:rPr>
+                <w:b/>
+                <w:color w:val="00A8CC"/>
+                <w:sz w:val="16"/>
+              </w:rPr>
+              <w:t>I7</w:t>
+            </w:r>
+          </w:p>
+        </w:tc>
+        <w:tc>
+          <w:tcPr>
+            <w:tcW w:type="dxa" w:w="3173"/>
+            <w:shd w:val="clear" w:color="auto" w:fill="FFFFFF"/>
+          </w:tcPr>
+          <w:p>
+            <w:r>
+              <w:rPr>
+                <w:b w:val="0"/>
+                <w:sz w:val="16"/>
+              </w:rPr>
+              <w:t>Investor</w:t>
+            </w:r>
+          </w:p>
+        </w:tc>
+        <w:tc>
+          <w:tcPr>
+            <w:tcW w:type="dxa" w:w="3173"/>
+            <w:shd w:val="clear" w:color="auto" w:fill="FFFFFF"/>
+          </w:tcPr>
+          <w:p>
+            <w:r>
+              <w:rPr>
+                <w:b w:val="0"/>
+                <w:sz w:val="16"/>
+              </w:rPr>
+              <w:t>Production Software</w:t>
+            </w:r>
+          </w:p>
+        </w:tc>
+      </w:tr>
+      <w:tr>
+        <w:tc>
+          <w:tcPr>
+            <w:tcW w:type="dxa" w:w="3173"/>
+            <w:shd w:val="clear" w:color="auto" w:fill="F2F5F8"/>
+          </w:tcPr>
+          <w:p>
+            <w:pPr>
+              <w:jc w:val="center"/>
+            </w:pPr>
+            <w:r>
+              <w:rPr>
+                <w:b/>
+                <w:color w:val="00A8CC"/>
+                <w:sz w:val="16"/>
+              </w:rPr>
+              <w:t>I8</w:t>
+            </w:r>
+          </w:p>
+        </w:tc>
+        <w:tc>
+          <w:tcPr>
+            <w:tcW w:type="dxa" w:w="3173"/>
+            <w:shd w:val="clear" w:color="auto" w:fill="F2F5F8"/>
+          </w:tcPr>
+          <w:p>
+            <w:r>
+              <w:rPr>
+                <w:b w:val="0"/>
+                <w:sz w:val="16"/>
+              </w:rPr>
+              <w:t>Head of Development &amp; Pre-series</w:t>
+            </w:r>
+          </w:p>
+        </w:tc>
+        <w:tc>
+          <w:tcPr>
+            <w:tcW w:type="dxa" w:w="3173"/>
+            <w:shd w:val="clear" w:color="auto" w:fill="F2F5F8"/>
+          </w:tcPr>
+          <w:p>
+            <w:r>
+              <w:rPr>
+                <w:b w:val="0"/>
+                <w:sz w:val="16"/>
+              </w:rPr>
+              <w:t>Automotive</w:t>
+            </w:r>
+          </w:p>
+        </w:tc>
+      </w:tr>
+      <w:tr>
+        <w:tc>
+          <w:tcPr>
+            <w:tcW w:type="dxa" w:w="3173"/>
+            <w:shd w:val="clear" w:color="auto" w:fill="FFFFFF"/>
+          </w:tcPr>
+          <w:p>
+            <w:pPr>
+              <w:jc w:val="center"/>
+            </w:pPr>
+            <w:r>
+              <w:rPr>
+                <w:b/>
+                <w:color w:val="00A8CC"/>
+                <w:sz w:val="16"/>
+              </w:rPr>
+              <w:t>I9</w:t>
+            </w:r>
+          </w:p>
+        </w:tc>
+        <w:tc>
+          <w:tcPr>
+            <w:tcW w:type="dxa" w:w="3173"/>
+            <w:shd w:val="clear" w:color="auto" w:fill="FFFFFF"/>
+          </w:tcPr>
+          <w:p>
+            <w:r>
+              <w:rPr>
+                <w:b w:val="0"/>
+                <w:sz w:val="16"/>
+              </w:rPr>
+              <w:t>R&amp;D Head</w:t>
+            </w:r>
+          </w:p>
+        </w:tc>
+        <w:tc>
+          <w:tcPr>
+            <w:tcW w:type="dxa" w:w="3173"/>
+            <w:shd w:val="clear" w:color="auto" w:fill="FFFFFF"/>
+          </w:tcPr>
+          <w:p>
+            <w:r>
+              <w:rPr>
+                <w:b w:val="0"/>
+                <w:sz w:val="16"/>
+              </w:rPr>
+              <w:t>Building Shadings</w:t>
+            </w:r>
+          </w:p>
+        </w:tc>
+      </w:tr>
+      <w:tr>
+        <w:tc>
+          <w:tcPr>
+            <w:tcW w:type="dxa" w:w="3173"/>
+            <w:shd w:val="clear" w:color="auto" w:fill="F2F5F8"/>
+          </w:tcPr>
+          <w:p>
+            <w:pPr>
+              <w:jc w:val="center"/>
+            </w:pPr>
+            <w:r>
+              <w:rPr>
+                <w:b/>
+                <w:color w:val="00A8CC"/>
+                <w:sz w:val="16"/>
+              </w:rPr>
+              <w:t>I10</w:t>
+            </w:r>
+          </w:p>
+        </w:tc>
+        <w:tc>
+          <w:tcPr>
+            <w:tcW w:type="dxa" w:w="3173"/>
+            <w:shd w:val="clear" w:color="auto" w:fill="F2F5F8"/>
+          </w:tcPr>
+          <w:p>
+            <w:r>
+              <w:rPr>
+                <w:b w:val="0"/>
+                <w:sz w:val="16"/>
+              </w:rPr>
+              <w:t>R&amp;D Head</w:t>
+            </w:r>
+          </w:p>
+        </w:tc>
+        <w:tc>
+          <w:tcPr>
+            <w:tcW w:type="dxa" w:w="3173"/>
+            <w:shd w:val="clear" w:color="auto" w:fill="F2F5F8"/>
+          </w:tcPr>
+          <w:p>
+            <w:r>
+              <w:rPr>
+                <w:b w:val="0"/>
+                <w:sz w:val="16"/>
+              </w:rPr>
+              <w:t>Electronics OEM</w:t>
+            </w:r>
+          </w:p>
+        </w:tc>
+      </w:tr>
+      <w:tr>
+        <w:tc>
+          <w:tcPr>
+            <w:tcW w:type="dxa" w:w="3173"/>
+            <w:shd w:val="clear" w:color="auto" w:fill="FFFFFF"/>
+          </w:tcPr>
+          <w:p>
+            <w:pPr>
+              <w:jc w:val="center"/>
+            </w:pPr>
+            <w:r>
+              <w:rPr>
+                <w:b/>
+                <w:color w:val="00A8CC"/>
+                <w:sz w:val="16"/>
+              </w:rPr>
+              <w:t>I11</w:t>
+            </w:r>
+          </w:p>
+        </w:tc>
+        <w:tc>
+          <w:tcPr>
+            <w:tcW w:type="dxa" w:w="3173"/>
+            <w:shd w:val="clear" w:color="auto" w:fill="FFFFFF"/>
+          </w:tcPr>
+          <w:p>
+            <w:r>
+              <w:rPr>
+                <w:b w:val="0"/>
+                <w:sz w:val="16"/>
+              </w:rPr>
+              <w:t>Mechanical Engineer</w:t>
+            </w:r>
+          </w:p>
+        </w:tc>
+        <w:tc>
+          <w:tcPr>
+            <w:tcW w:type="dxa" w:w="3173"/>
+            <w:shd w:val="clear" w:color="auto" w:fill="FFFFFF"/>
+          </w:tcPr>
+          <w:p>
+            <w:r>
+              <w:rPr>
+                <w:b w:val="0"/>
+                <w:sz w:val="16"/>
+              </w:rPr>
+              <w:t>Engineering Services</w:t>
+            </w:r>
+          </w:p>
+        </w:tc>
+      </w:tr>
+      <w:tr>
+        <w:tc>
+          <w:tcPr>
+            <w:tcW w:type="dxa" w:w="3173"/>
+            <w:shd w:val="clear" w:color="auto" w:fill="F2F5F8"/>
+          </w:tcPr>
+          <w:p>
+            <w:pPr>
+              <w:jc w:val="center"/>
+            </w:pPr>
+            <w:r>
+              <w:rPr>
+                <w:b/>
+                <w:color w:val="00A8CC"/>
+                <w:sz w:val="16"/>
+              </w:rPr>
+              <w:t>I12</w:t>
+            </w:r>
+          </w:p>
+        </w:tc>
+        <w:tc>
+          <w:tcPr>
+            <w:tcW w:type="dxa" w:w="3173"/>
+            <w:shd w:val="clear" w:color="auto" w:fill="F2F5F8"/>
+          </w:tcPr>
+          <w:p>
+            <w:r>
+              <w:rPr>
+                <w:b w:val="0"/>
+                <w:sz w:val="16"/>
+              </w:rPr>
+              <w:t>Mechanical Engineer</w:t>
+            </w:r>
+          </w:p>
+        </w:tc>
+        <w:tc>
+          <w:tcPr>
+            <w:tcW w:type="dxa" w:w="3173"/>
+            <w:shd w:val="clear" w:color="auto" w:fill="F2F5F8"/>
+          </w:tcPr>
+          <w:p>
+            <w:r>
+              <w:rPr>
+                <w:b w:val="0"/>
+                <w:sz w:val="16"/>
+              </w:rPr>
+              <w:t>Academia</w:t>
+            </w:r>
+          </w:p>
+        </w:tc>
+      </w:tr>
+      <w:tr>
+        <w:tc>
+          <w:tcPr>
+            <w:tcW w:type="dxa" w:w="3173"/>
+            <w:shd w:val="clear" w:color="auto" w:fill="FFFFFF"/>
+          </w:tcPr>
+          <w:p>
+            <w:pPr>
+              <w:jc w:val="center"/>
+            </w:pPr>
+            <w:r>
+              <w:rPr>
+                <w:b/>
+                <w:color w:val="00A8CC"/>
+                <w:sz w:val="16"/>
+              </w:rPr>
+              <w:t>I13</w:t>
+            </w:r>
+          </w:p>
+        </w:tc>
+        <w:tc>
+          <w:tcPr>
+            <w:tcW w:type="dxa" w:w="3173"/>
+            <w:shd w:val="clear" w:color="auto" w:fill="FFFFFF"/>
+          </w:tcPr>
+          <w:p>
+            <w:r>
+              <w:rPr>
+                <w:b w:val="0"/>
+                <w:sz w:val="16"/>
+              </w:rPr>
+              <w:t>Co-Founder</w:t>
+            </w:r>
+          </w:p>
+        </w:tc>
+        <w:tc>
+          <w:tcPr>
+            <w:tcW w:type="dxa" w:w="3173"/>
+            <w:shd w:val="clear" w:color="auto" w:fill="FFFFFF"/>
+          </w:tcPr>
+          <w:p>
+            <w:r>
+              <w:rPr>
+                <w:b w:val="0"/>
+                <w:sz w:val="16"/>
+              </w:rPr>
+              <w:t>Engineering Services</w:t>
+            </w:r>
+          </w:p>
+        </w:tc>
+      </w:tr>
+      <w:tr>
+        <w:tc>
+          <w:tcPr>
+            <w:tcW w:type="dxa" w:w="3173"/>
+            <w:shd w:val="clear" w:color="auto" w:fill="F2F5F8"/>
+          </w:tcPr>
+          <w:p>
+            <w:pPr>
+              <w:jc w:val="center"/>
+            </w:pPr>
+            <w:r>
+              <w:rPr>
+                <w:b/>
+                <w:color w:val="00A8CC"/>
+                <w:sz w:val="16"/>
+              </w:rPr>
+              <w:t>I14</w:t>
+            </w:r>
+          </w:p>
+        </w:tc>
+        <w:tc>
+          <w:tcPr>
+            <w:tcW w:type="dxa" w:w="3173"/>
+            <w:shd w:val="clear" w:color="auto" w:fill="F2F5F8"/>
+          </w:tcPr>
+          <w:p>
+            <w:r>
+              <w:rPr>
+                <w:b w:val="0"/>
+                <w:sz w:val="16"/>
+              </w:rPr>
+              <w:t>Process Engineer</w:t>
+            </w:r>
+          </w:p>
+        </w:tc>
+        <w:tc>
+          <w:tcPr>
+            <w:tcW w:type="dxa" w:w="3173"/>
+            <w:shd w:val="clear" w:color="auto" w:fill="F2F5F8"/>
+          </w:tcPr>
+          <w:p>
+            <w:r>
+              <w:rPr>
+                <w:b w:val="0"/>
+                <w:sz w:val="16"/>
+              </w:rPr>
+              <w:t>Packaging</w:t>
+            </w:r>
+          </w:p>
+        </w:tc>
+      </w:tr>
+      <w:tr>
+        <w:tc>
+          <w:tcPr>
+            <w:tcW w:type="dxa" w:w="3173"/>
+            <w:shd w:val="clear" w:color="auto" w:fill="FFFFFF"/>
+          </w:tcPr>
+          <w:p>
+            <w:pPr>
+              <w:jc w:val="center"/>
+            </w:pPr>
+            <w:r>
+              <w:rPr>
+                <w:b/>
+                <w:color w:val="00A8CC"/>
+                <w:sz w:val="16"/>
+              </w:rPr>
+              <w:t>I15</w:t>
+            </w:r>
+          </w:p>
+        </w:tc>
+        <w:tc>
+          <w:tcPr>
+            <w:tcW w:type="dxa" w:w="3173"/>
+            <w:shd w:val="clear" w:color="auto" w:fill="FFFFFF"/>
+          </w:tcPr>
+          <w:p>
+            <w:r>
+              <w:rPr>
+                <w:b w:val="0"/>
+                <w:sz w:val="16"/>
+              </w:rPr>
+              <w:t>Senior Director of Strategy</w:t>
+            </w:r>
+          </w:p>
+        </w:tc>
+        <w:tc>
+          <w:tcPr>
+            <w:tcW w:type="dxa" w:w="3173"/>
+            <w:shd w:val="clear" w:color="auto" w:fill="FFFFFF"/>
+          </w:tcPr>
+          <w:p>
+            <w:r>
+              <w:rPr>
+                <w:b w:val="0"/>
+                <w:sz w:val="16"/>
+              </w:rPr>
+              <w:t>Consulting</w:t>
+            </w:r>
+          </w:p>
+        </w:tc>
+      </w:tr>
+      <w:tr>
+        <w:tc>
+          <w:tcPr>
+            <w:tcW w:type="dxa" w:w="3173"/>
+            <w:shd w:val="clear" w:color="auto" w:fill="F2F5F8"/>
+          </w:tcPr>
+          <w:p>
+            <w:pPr>
+              <w:jc w:val="center"/>
+            </w:pPr>
+            <w:r>
+              <w:rPr>
+                <w:b/>
+                <w:color w:val="00A8CC"/>
+                <w:sz w:val="16"/>
+              </w:rPr>
+              <w:t>I16</w:t>
+            </w:r>
+          </w:p>
+        </w:tc>
+        <w:tc>
+          <w:tcPr>
+            <w:tcW w:type="dxa" w:w="3173"/>
+            <w:shd w:val="clear" w:color="auto" w:fill="F2F5F8"/>
+          </w:tcPr>
+          <w:p>
+            <w:r>
+              <w:rPr>
+                <w:b w:val="0"/>
+                <w:sz w:val="16"/>
+              </w:rPr>
+              <w:t>Postdoctoral Researcher</w:t>
+            </w:r>
+          </w:p>
+        </w:tc>
+        <w:tc>
+          <w:tcPr>
+            <w:tcW w:type="dxa" w:w="3173"/>
+            <w:shd w:val="clear" w:color="auto" w:fill="F2F5F8"/>
+          </w:tcPr>
+          <w:p>
+            <w:r>
+              <w:rPr>
+                <w:b w:val="0"/>
+                <w:sz w:val="16"/>
+              </w:rPr>
+              <w:t>Academia</w:t>
+            </w:r>
+          </w:p>
+        </w:tc>
+      </w:tr>
+      <w:tr>
+        <w:tc>
+          <w:tcPr>
+            <w:tcW w:type="dxa" w:w="3173"/>
+            <w:shd w:val="clear" w:color="auto" w:fill="FFFFFF"/>
+          </w:tcPr>
+          <w:p>
+            <w:pPr>
+              <w:jc w:val="center"/>
+            </w:pPr>
+            <w:r>
+              <w:rPr>
+                <w:b/>
+                <w:color w:val="00A8CC"/>
+                <w:sz w:val="16"/>
+              </w:rPr>
+              <w:t>I17</w:t>
+            </w:r>
+          </w:p>
+        </w:tc>
+        <w:tc>
+          <w:tcPr>
+            <w:tcW w:type="dxa" w:w="3173"/>
+            <w:shd w:val="clear" w:color="auto" w:fill="FFFFFF"/>
+          </w:tcPr>
+          <w:p>
+            <w:r>
+              <w:rPr>
+                <w:b w:val="0"/>
+                <w:sz w:val="16"/>
+              </w:rPr>
+              <w:t>General Manager</w:t>
+            </w:r>
+          </w:p>
+        </w:tc>
+        <w:tc>
+          <w:tcPr>
+            <w:tcW w:type="dxa" w:w="3173"/>
+            <w:shd w:val="clear" w:color="auto" w:fill="FFFFFF"/>
+          </w:tcPr>
+          <w:p>
+            <w:r>
+              <w:rPr>
+                <w:b w:val="0"/>
+                <w:sz w:val="16"/>
+              </w:rPr>
+              <w:t>Electronics OEM</w:t>
+            </w:r>
+          </w:p>
+        </w:tc>
+      </w:tr>
+      <w:tr>
+        <w:tc>
+          <w:tcPr>
+            <w:tcW w:type="dxa" w:w="3173"/>
+            <w:shd w:val="clear" w:color="auto" w:fill="F2F5F8"/>
+          </w:tcPr>
+          <w:p>
+            <w:pPr>
+              <w:jc w:val="center"/>
+            </w:pPr>
+            <w:r>
+              <w:rPr>
+                <w:b/>
+                <w:color w:val="00A8CC"/>
+                <w:sz w:val="16"/>
+              </w:rPr>
+              <w:t>I18</w:t>
+            </w:r>
+          </w:p>
+        </w:tc>
+        <w:tc>
+          <w:tcPr>
+            <w:tcW w:type="dxa" w:w="3173"/>
+            <w:shd w:val="clear" w:color="auto" w:fill="F2F5F8"/>
+          </w:tcPr>
+          <w:p>
+            <w:r>
+              <w:rPr>
+                <w:b w:val="0"/>
+                <w:sz w:val="16"/>
+              </w:rPr>
+              <w:t>Consultant, Founder</w:t>
+            </w:r>
+          </w:p>
+        </w:tc>
+        <w:tc>
+          <w:tcPr>
+            <w:tcW w:type="dxa" w:w="3173"/>
+            <w:shd w:val="clear" w:color="auto" w:fill="F2F5F8"/>
+          </w:tcPr>
+          <w:p>
+            <w:r>
+              <w:rPr>
+                <w:b w:val="0"/>
+                <w:sz w:val="16"/>
+              </w:rPr>
+              <w:t>Sustainability Consulting</w:t>
+            </w:r>
+          </w:p>
+        </w:tc>
+      </w:tr>
+      <w:tr>
+        <w:tc>
+          <w:tcPr>
+            <w:tcW w:type="dxa" w:w="3173"/>
+            <w:shd w:val="clear" w:color="auto" w:fill="FFFFFF"/>
+          </w:tcPr>
+          <w:p>
+            <w:pPr>
+              <w:jc w:val="center"/>
+            </w:pPr>
+            <w:r>
+              <w:rPr>
+                <w:b/>
+                <w:color w:val="00A8CC"/>
+                <w:sz w:val="16"/>
+              </w:rPr>
+              <w:t>I19</w:t>
+            </w:r>
+          </w:p>
+        </w:tc>
+        <w:tc>
+          <w:tcPr>
+            <w:tcW w:type="dxa" w:w="3173"/>
+            <w:shd w:val="clear" w:color="auto" w:fill="FFFFFF"/>
+          </w:tcPr>
+          <w:p>
+            <w:r>
+              <w:rPr>
+                <w:b w:val="0"/>
+                <w:sz w:val="16"/>
+              </w:rPr>
+              <w:t>Product Designer, Founder</w:t>
+            </w:r>
+          </w:p>
+        </w:tc>
+        <w:tc>
+          <w:tcPr>
+            <w:tcW w:type="dxa" w:w="3173"/>
+            <w:shd w:val="clear" w:color="auto" w:fill="FFFFFF"/>
+          </w:tcPr>
+          <w:p>
+            <w:r>
+              <w:rPr>
+                <w:b w:val="0"/>
+                <w:sz w:val="16"/>
+              </w:rPr>
+              <w:t>Engineering Services</w:t>
+            </w:r>
+          </w:p>
+        </w:tc>
+      </w:tr>
+      <w:tr>
+        <w:tc>
+          <w:tcPr>
+            <w:tcW w:type="dxa" w:w="3173"/>
+            <w:shd w:val="clear" w:color="auto" w:fill="F2F5F8"/>
+          </w:tcPr>
+          <w:p>
+            <w:pPr>
+              <w:jc w:val="center"/>
+            </w:pPr>
+            <w:r>
+              <w:rPr>
+                <w:b/>
+                <w:color w:val="00A8CC"/>
+                <w:sz w:val="16"/>
+              </w:rPr>
+              <w:t>I20</w:t>
+            </w:r>
+          </w:p>
+        </w:tc>
+        <w:tc>
+          <w:tcPr>
+            <w:tcW w:type="dxa" w:w="3173"/>
+            <w:shd w:val="clear" w:color="auto" w:fill="F2F5F8"/>
+          </w:tcPr>
+          <w:p>
+            <w:r>
+              <w:rPr>
+                <w:b w:val="0"/>
+                <w:sz w:val="16"/>
+              </w:rPr>
+              <w:t>Design Engineer</w:t>
+            </w:r>
+          </w:p>
+        </w:tc>
+        <w:tc>
+          <w:tcPr>
+            <w:tcW w:type="dxa" w:w="3173"/>
+            <w:shd w:val="clear" w:color="auto" w:fill="F2F5F8"/>
+          </w:tcPr>
+          <w:p>
+            <w:r>
+              <w:rPr>
+                <w:b w:val="0"/>
+                <w:sz w:val="16"/>
+              </w:rPr>
+              <w:t>Automotive</w:t>
+            </w:r>
+          </w:p>
+        </w:tc>
+      </w:tr>
+      <w:tr>
+        <w:tc>
+          <w:tcPr>
+            <w:tcW w:type="dxa" w:w="3173"/>
+            <w:shd w:val="clear" w:color="auto" w:fill="FFFFFF"/>
+          </w:tcPr>
+          <w:p>
+            <w:pPr>
+              <w:jc w:val="center"/>
+            </w:pPr>
+            <w:r>
+              <w:rPr>
+                <w:b/>
+                <w:color w:val="00A8CC"/>
+                <w:sz w:val="16"/>
+              </w:rPr>
+              <w:t>I21</w:t>
+            </w:r>
+          </w:p>
+        </w:tc>
+        <w:tc>
+          <w:tcPr>
+            <w:tcW w:type="dxa" w:w="3173"/>
+            <w:shd w:val="clear" w:color="auto" w:fill="FFFFFF"/>
+          </w:tcPr>
+          <w:p>
+            <w:r>
+              <w:rPr>
+                <w:b w:val="0"/>
+                <w:sz w:val="16"/>
+              </w:rPr>
+              <w:t>Civil Engineer</w:t>
+            </w:r>
+          </w:p>
+        </w:tc>
+        <w:tc>
+          <w:tcPr>
+            <w:tcW w:type="dxa" w:w="3173"/>
+            <w:shd w:val="clear" w:color="auto" w:fill="FFFFFF"/>
+          </w:tcPr>
+          <w:p>
+            <w:r>
+              <w:rPr>
+                <w:b w:val="0"/>
+                <w:sz w:val="16"/>
+              </w:rPr>
+              <w:t>Engineering Services</w:t>
+            </w:r>
+          </w:p>
+        </w:tc>
+      </w:tr>
+      <w:tr>
+        <w:tc>
+          <w:tcPr>
+            <w:tcW w:type="dxa" w:w="3173"/>
+            <w:shd w:val="clear" w:color="auto" w:fill="F2F5F8"/>
+          </w:tcPr>
+          <w:p>
+            <w:pPr>
+              <w:jc w:val="center"/>
+            </w:pPr>
+            <w:r>
+              <w:rPr>
+                <w:b/>
+                <w:color w:val="00A8CC"/>
+                <w:sz w:val="16"/>
+              </w:rPr>
+              <w:t>I22</w:t>
+            </w:r>
+          </w:p>
+        </w:tc>
+        <w:tc>
+          <w:tcPr>
+            <w:tcW w:type="dxa" w:w="3173"/>
+            <w:shd w:val="clear" w:color="auto" w:fill="F2F5F8"/>
+          </w:tcPr>
+          <w:p>
+            <w:r>
+              <w:rPr>
+                <w:b w:val="0"/>
+                <w:sz w:val="16"/>
+              </w:rPr>
+              <w:t>Team Leader Strategy (Std. Products)</w:t>
+            </w:r>
+          </w:p>
+        </w:tc>
+        <w:tc>
+          <w:tcPr>
+            <w:tcW w:type="dxa" w:w="3173"/>
+            <w:shd w:val="clear" w:color="auto" w:fill="F2F5F8"/>
+          </w:tcPr>
+          <w:p>
+            <w:r>
+              <w:rPr>
+                <w:b w:val="0"/>
+                <w:sz w:val="16"/>
+              </w:rPr>
+              <w:t>Electronics OEM</w:t>
+            </w:r>
+          </w:p>
+        </w:tc>
+      </w:tr>
+      <w:tr>
+        <w:tc>
+          <w:tcPr>
+            <w:tcW w:type="dxa" w:w="3173"/>
+            <w:shd w:val="clear" w:color="auto" w:fill="FFFFFF"/>
+          </w:tcPr>
+          <w:p>
+            <w:pPr>
+              <w:jc w:val="center"/>
+            </w:pPr>
+            <w:r>
+              <w:rPr>
+                <w:b/>
+                <w:color w:val="00A8CC"/>
+                <w:sz w:val="16"/>
+              </w:rPr>
+              <w:t>I23</w:t>
+            </w:r>
+          </w:p>
+        </w:tc>
+        <w:tc>
+          <w:tcPr>
+            <w:tcW w:type="dxa" w:w="3173"/>
+            <w:shd w:val="clear" w:color="auto" w:fill="FFFFFF"/>
+          </w:tcPr>
+          <w:p>
+            <w:r>
+              <w:rPr>
+                <w:b w:val="0"/>
+                <w:sz w:val="16"/>
+              </w:rPr>
+              <w:t>Product Designer (Thermal Solutions)</w:t>
+            </w:r>
+          </w:p>
+        </w:tc>
+        <w:tc>
+          <w:tcPr>
+            <w:tcW w:type="dxa" w:w="3173"/>
+            <w:shd w:val="clear" w:color="auto" w:fill="FFFFFF"/>
+          </w:tcPr>
+          <w:p>
+            <w:r>
+              <w:rPr>
+                <w:b w:val="0"/>
+                <w:sz w:val="16"/>
+              </w:rPr>
+              <w:t>Engineering Services</w:t>
+            </w:r>
+          </w:p>
+        </w:tc>
+      </w:tr>
+      <w:tr>
+        <w:tc>
+          <w:tcPr>
+            <w:tcW w:type="dxa" w:w="3173"/>
+            <w:shd w:val="clear" w:color="auto" w:fill="F2F5F8"/>
+          </w:tcPr>
+          <w:p>
+            <w:pPr>
+              <w:jc w:val="center"/>
+            </w:pPr>
+            <w:r>
+              <w:rPr>
+                <w:b/>
+                <w:color w:val="00A8CC"/>
+                <w:sz w:val="16"/>
+              </w:rPr>
+              <w:t>I24</w:t>
+            </w:r>
+          </w:p>
+        </w:tc>
+        <w:tc>
+          <w:tcPr>
+            <w:tcW w:type="dxa" w:w="3173"/>
+            <w:shd w:val="clear" w:color="auto" w:fill="F2F5F8"/>
+          </w:tcPr>
+          <w:p>
+            <w:r>
+              <w:rPr>
+                <w:b w:val="0"/>
+                <w:sz w:val="16"/>
+              </w:rPr>
+              <w:t>Product &amp; Process Engineer</w:t>
+            </w:r>
+          </w:p>
+        </w:tc>
+        <w:tc>
+          <w:tcPr>
+            <w:tcW w:type="dxa" w:w="3173"/>
+            <w:shd w:val="clear" w:color="auto" w:fill="F2F5F8"/>
+          </w:tcPr>
+          <w:p>
+            <w:r>
+              <w:rPr>
+                <w:b w:val="0"/>
+                <w:sz w:val="16"/>
+              </w:rPr>
+              <w:t>Automotive OEM</w:t>
+            </w:r>
+          </w:p>
+        </w:tc>
+      </w:tr>
+      <w:tr>
+        <w:tc>
+          <w:tcPr>
+            <w:tcW w:type="dxa" w:w="3173"/>
+            <w:shd w:val="clear" w:color="auto" w:fill="FFFFFF"/>
+          </w:tcPr>
+          <w:p>
+            <w:pPr>
+              <w:jc w:val="center"/>
+            </w:pPr>
+            <w:r>
+              <w:rPr>
+                <w:b/>
+                <w:color w:val="00A8CC"/>
+                <w:sz w:val="16"/>
+              </w:rPr>
+              <w:t>I25</w:t>
+            </w:r>
+          </w:p>
+        </w:tc>
+        <w:tc>
+          <w:tcPr>
+            <w:tcW w:type="dxa" w:w="3173"/>
+            <w:shd w:val="clear" w:color="auto" w:fill="FFFFFF"/>
+          </w:tcPr>
+          <w:p>
+            <w:r>
+              <w:rPr>
+                <w:b w:val="0"/>
+                <w:sz w:val="16"/>
+              </w:rPr>
+              <w:t>Product Development Team Lead</w:t>
+            </w:r>
+          </w:p>
+        </w:tc>
+        <w:tc>
+          <w:tcPr>
+            <w:tcW w:type="dxa" w:w="3173"/>
+            <w:shd w:val="clear" w:color="auto" w:fill="FFFFFF"/>
+          </w:tcPr>
+          <w:p>
+            <w:r>
+              <w:rPr>
+                <w:b w:val="0"/>
+                <w:sz w:val="16"/>
+              </w:rPr>
+              <w:t>Automotive OEM</w:t>
+            </w:r>
+          </w:p>
+        </w:tc>
+      </w:tr>
+      <w:tr>
+        <w:tc>
+          <w:tcPr>
+            <w:tcW w:type="dxa" w:w="3173"/>
+            <w:shd w:val="clear" w:color="auto" w:fill="F2F5F8"/>
+          </w:tcPr>
+          <w:p>
+            <w:pPr>
+              <w:jc w:val="center"/>
+            </w:pPr>
+            <w:r>
+              <w:rPr>
+                <w:b/>
+                <w:color w:val="00A8CC"/>
+                <w:sz w:val="16"/>
+              </w:rPr>
+              <w:t>I26</w:t>
+            </w:r>
+          </w:p>
+        </w:tc>
+        <w:tc>
+          <w:tcPr>
+            <w:tcW w:type="dxa" w:w="3173"/>
+            <w:shd w:val="clear" w:color="auto" w:fill="F2F5F8"/>
+          </w:tcPr>
+          <w:p>
+            <w:r>
+              <w:rPr>
+                <w:b w:val="0"/>
+                <w:sz w:val="16"/>
+              </w:rPr>
+              <w:t>Project Manager</w:t>
+            </w:r>
+          </w:p>
+        </w:tc>
+        <w:tc>
+          <w:tcPr>
+            <w:tcW w:type="dxa" w:w="3173"/>
+            <w:shd w:val="clear" w:color="auto" w:fill="F2F5F8"/>
+          </w:tcPr>
+          <w:p>
+            <w:r>
+              <w:rPr>
+                <w:b w:val="0"/>
+                <w:sz w:val="16"/>
+              </w:rPr>
+              <w:t>Electronics OEM</w:t>
+            </w:r>
+          </w:p>
+        </w:tc>
+      </w:tr>
+      <w:tr>
+        <w:tc>
+          <w:tcPr>
+            <w:tcW w:type="dxa" w:w="3173"/>
+            <w:shd w:val="clear" w:color="auto" w:fill="FFFFFF"/>
+          </w:tcPr>
+          <w:p>
+            <w:pPr>
+              <w:jc w:val="center"/>
+            </w:pPr>
+            <w:r>
+              <w:rPr>
+                <w:b/>
+                <w:color w:val="00A8CC"/>
+                <w:sz w:val="16"/>
+              </w:rPr>
+              <w:t>I27</w:t>
+            </w:r>
+          </w:p>
+        </w:tc>
+        <w:tc>
+          <w:tcPr>
+            <w:tcW w:type="dxa" w:w="3173"/>
+            <w:shd w:val="clear" w:color="auto" w:fill="FFFFFF"/>
+          </w:tcPr>
+          <w:p>
+            <w:r>
+              <w:rPr>
+                <w:b w:val="0"/>
+                <w:sz w:val="16"/>
+              </w:rPr>
+              <w:t>Product &amp; Process Engineer</w:t>
+            </w:r>
+          </w:p>
+        </w:tc>
+        <w:tc>
+          <w:tcPr>
+            <w:tcW w:type="dxa" w:w="3173"/>
+            <w:shd w:val="clear" w:color="auto" w:fill="FFFFFF"/>
+          </w:tcPr>
+          <w:p>
+            <w:r>
+              <w:rPr>
+                <w:b w:val="0"/>
+                <w:sz w:val="16"/>
+              </w:rPr>
+              <w:t>Automotive OEM</w:t>
+            </w:r>
+          </w:p>
+        </w:tc>
+      </w:tr>
+      <w:tr>
+        <w:tc>
+          <w:tcPr>
+            <w:tcW w:type="dxa" w:w="3173"/>
+            <w:shd w:val="clear" w:color="auto" w:fill="F2F5F8"/>
+          </w:tcPr>
+          <w:p>
+            <w:pPr>
+              <w:jc w:val="center"/>
+            </w:pPr>
+            <w:r>
+              <w:rPr>
+                <w:b/>
+                <w:color w:val="00A8CC"/>
+                <w:sz w:val="16"/>
+              </w:rPr>
+              <w:t>I28</w:t>
+            </w:r>
+          </w:p>
+        </w:tc>
+        <w:tc>
+          <w:tcPr>
+            <w:tcW w:type="dxa" w:w="3173"/>
+            <w:shd w:val="clear" w:color="auto" w:fill="F2F5F8"/>
+          </w:tcPr>
+          <w:p>
+            <w:r>
+              <w:rPr>
+                <w:b w:val="0"/>
+                <w:sz w:val="16"/>
+              </w:rPr>
+              <w:t>Consultant, Founder</w:t>
+            </w:r>
+          </w:p>
+        </w:tc>
+        <w:tc>
+          <w:tcPr>
+            <w:tcW w:type="dxa" w:w="3173"/>
+            <w:shd w:val="clear" w:color="auto" w:fill="F2F5F8"/>
+          </w:tcPr>
+          <w:p>
+            <w:r>
+              <w:rPr>
+                <w:b w:val="0"/>
+                <w:sz w:val="16"/>
+              </w:rPr>
+              <w:t>Engineering Services</w:t>
+            </w:r>
+          </w:p>
+        </w:tc>
+      </w:tr>
+      <w:tr>
+        <w:tc>
+          <w:tcPr>
+            <w:tcW w:type="dxa" w:w="3173"/>
+            <w:shd w:val="clear" w:color="auto" w:fill="FFFFFF"/>
+          </w:tcPr>
+          <w:p>
+            <w:pPr>
+              <w:jc w:val="center"/>
+            </w:pPr>
+            <w:r>
+              <w:rPr>
+                <w:b/>
+                <w:color w:val="00A8CC"/>
+                <w:sz w:val="16"/>
+              </w:rPr>
+              <w:t>I29</w:t>
+            </w:r>
+          </w:p>
+        </w:tc>
+        <w:tc>
+          <w:tcPr>
+            <w:tcW w:type="dxa" w:w="3173"/>
+            <w:shd w:val="clear" w:color="auto" w:fill="FFFFFF"/>
+          </w:tcPr>
+          <w:p>
+            <w:r>
+              <w:rPr>
+                <w:b w:val="0"/>
+                <w:sz w:val="16"/>
+              </w:rPr>
+              <w:t>Advanced Design Engineer</w:t>
+            </w:r>
+          </w:p>
+        </w:tc>
+        <w:tc>
+          <w:tcPr>
+            <w:tcW w:type="dxa" w:w="3173"/>
+            <w:shd w:val="clear" w:color="auto" w:fill="FFFFFF"/>
+          </w:tcPr>
+          <w:p>
+            <w:r>
+              <w:rPr>
+                <w:b w:val="0"/>
+                <w:sz w:val="16"/>
+              </w:rPr>
+              <w:t>Automotive OEM</w:t>
+            </w:r>
+          </w:p>
+        </w:tc>
+      </w:tr>
+      <w:tr>
+        <w:tc>
+          <w:tcPr>
+            <w:tcW w:type="dxa" w:w="3173"/>
+            <w:shd w:val="clear" w:color="auto" w:fill="F2F5F8"/>
+          </w:tcPr>
+          <w:p>
+            <w:pPr>
+              <w:jc w:val="center"/>
+            </w:pPr>
+            <w:r>
+              <w:rPr>
+                <w:b/>
+                <w:color w:val="00A8CC"/>
+                <w:sz w:val="16"/>
+              </w:rPr>
+              <w:t>I30</w:t>
+            </w:r>
+          </w:p>
+        </w:tc>
+        <w:tc>
+          <w:tcPr>
+            <w:tcW w:type="dxa" w:w="3173"/>
+            <w:shd w:val="clear" w:color="auto" w:fill="F2F5F8"/>
+          </w:tcPr>
+          <w:p>
+            <w:r>
+              <w:rPr>
+                <w:b w:val="0"/>
+                <w:sz w:val="16"/>
+              </w:rPr>
+              <w:t>Consultant</w:t>
+            </w:r>
+          </w:p>
+        </w:tc>
+        <w:tc>
+          <w:tcPr>
+            <w:tcW w:type="dxa" w:w="3173"/>
+            <w:shd w:val="clear" w:color="auto" w:fill="F2F5F8"/>
+          </w:tcPr>
+          <w:p>
+            <w:r>
+              <w:rPr>
+                <w:b w:val="0"/>
+                <w:sz w:val="16"/>
+              </w:rPr>
+              <w:t>Engineering Software Consulting</w:t>
+            </w:r>
+          </w:p>
+        </w:tc>
+      </w:tr>
+      <w:tr>
+        <w:tc>
+          <w:tcPr>
+            <w:tcW w:type="dxa" w:w="3173"/>
+            <w:shd w:val="clear" w:color="auto" w:fill="FFFFFF"/>
+          </w:tcPr>
+          <w:p>
+            <w:pPr>
+              <w:jc w:val="center"/>
+            </w:pPr>
+            <w:r>
+              <w:rPr>
+                <w:b/>
+                <w:color w:val="00A8CC"/>
+                <w:sz w:val="16"/>
+              </w:rPr>
+              <w:t>I31</w:t>
+            </w:r>
+          </w:p>
+        </w:tc>
+        <w:tc>
+          <w:tcPr>
+            <w:tcW w:type="dxa" w:w="3173"/>
+            <w:shd w:val="clear" w:color="auto" w:fill="FFFFFF"/>
+          </w:tcPr>
+          <w:p>
+            <w:r>
+              <w:rPr>
+                <w:b w:val="0"/>
+                <w:sz w:val="16"/>
+              </w:rPr>
+              <w:t>Sustainability Manager</w:t>
+            </w:r>
+          </w:p>
+        </w:tc>
+        <w:tc>
+          <w:tcPr>
+            <w:tcW w:type="dxa" w:w="3173"/>
+            <w:shd w:val="clear" w:color="auto" w:fill="FFFFFF"/>
+          </w:tcPr>
+          <w:p>
+            <w:r>
+              <w:rPr>
+                <w:b w:val="0"/>
+                <w:sz w:val="16"/>
+              </w:rPr>
+              <w:t>Material Handling</w:t>
+            </w:r>
+          </w:p>
+        </w:tc>
+      </w:tr>
+      <w:tr>
+        <w:tc>
+          <w:tcPr>
+            <w:tcW w:type="dxa" w:w="3173"/>
+            <w:shd w:val="clear" w:color="auto" w:fill="F2F5F8"/>
+          </w:tcPr>
+          <w:p>
+            <w:pPr>
+              <w:jc w:val="center"/>
+            </w:pPr>
+            <w:r>
+              <w:rPr>
+                <w:b/>
+                <w:color w:val="00A8CC"/>
+                <w:sz w:val="16"/>
+              </w:rPr>
+              <w:t>I32</w:t>
+            </w:r>
+          </w:p>
+        </w:tc>
+        <w:tc>
+          <w:tcPr>
+            <w:tcW w:type="dxa" w:w="3173"/>
+            <w:shd w:val="clear" w:color="auto" w:fill="F2F5F8"/>
+          </w:tcPr>
+          <w:p>
+            <w:r>
+              <w:rPr>
+                <w:b w:val="0"/>
+                <w:sz w:val="16"/>
+              </w:rPr>
+              <w:t>Product Manager</w:t>
+            </w:r>
+          </w:p>
+        </w:tc>
+        <w:tc>
+          <w:tcPr>
+            <w:tcW w:type="dxa" w:w="3173"/>
+            <w:shd w:val="clear" w:color="auto" w:fill="F2F5F8"/>
+          </w:tcPr>
+          <w:p>
+            <w:r>
+              <w:rPr>
+                <w:b w:val="0"/>
+                <w:sz w:val="16"/>
+              </w:rPr>
+              <w:t>Material Handling</w:t>
+            </w:r>
+          </w:p>
+        </w:tc>
+      </w:tr>
+      <w:tr>
+        <w:tc>
+          <w:tcPr>
+            <w:tcW w:type="dxa" w:w="3173"/>
+            <w:shd w:val="clear" w:color="auto" w:fill="FFFFFF"/>
+          </w:tcPr>
+          <w:p>
+            <w:pPr>
+              <w:jc w:val="center"/>
+            </w:pPr>
+            <w:r>
+              <w:rPr>
+                <w:b/>
+                <w:color w:val="00A8CC"/>
+                <w:sz w:val="16"/>
+              </w:rPr>
+              <w:t>I33</w:t>
+            </w:r>
+          </w:p>
+        </w:tc>
+        <w:tc>
+          <w:tcPr>
+            <w:tcW w:type="dxa" w:w="3173"/>
+            <w:shd w:val="clear" w:color="auto" w:fill="FFFFFF"/>
+          </w:tcPr>
+          <w:p>
+            <w:r>
+              <w:rPr>
+                <w:b w:val="0"/>
+                <w:sz w:val="16"/>
+              </w:rPr>
+              <w:t>Product Developer</w:t>
+            </w:r>
+          </w:p>
+        </w:tc>
+        <w:tc>
+          <w:tcPr>
+            <w:tcW w:type="dxa" w:w="3173"/>
+            <w:shd w:val="clear" w:color="auto" w:fill="FFFFFF"/>
+          </w:tcPr>
+          <w:p>
+            <w:r>
+              <w:rPr>
+                <w:b w:val="0"/>
+                <w:sz w:val="16"/>
+              </w:rPr>
+              <w:t>Rail Rolling Stock</w:t>
+            </w:r>
+          </w:p>
+        </w:tc>
+      </w:tr>
+      <w:tr>
+        <w:tc>
+          <w:tcPr>
+            <w:tcW w:type="dxa" w:w="3173"/>
+            <w:shd w:val="clear" w:color="auto" w:fill="F2F5F8"/>
+          </w:tcPr>
+          <w:p>
+            <w:pPr>
+              <w:jc w:val="center"/>
+            </w:pPr>
+            <w:r>
+              <w:rPr>
+                <w:b/>
+                <w:color w:val="00A8CC"/>
+                <w:sz w:val="16"/>
+              </w:rPr>
+              <w:t>I34</w:t>
+            </w:r>
+          </w:p>
+        </w:tc>
+        <w:tc>
+          <w:tcPr>
+            <w:tcW w:type="dxa" w:w="3173"/>
+            <w:shd w:val="clear" w:color="auto" w:fill="F2F5F8"/>
+          </w:tcPr>
+          <w:p>
+            <w:r>
+              <w:rPr>
+                <w:b w:val="0"/>
+                <w:sz w:val="16"/>
+              </w:rPr>
+              <w:t>CIO, Software Engineer</w:t>
+            </w:r>
+          </w:p>
+        </w:tc>
+        <w:tc>
+          <w:tcPr>
+            <w:tcW w:type="dxa" w:w="3173"/>
+            <w:shd w:val="clear" w:color="auto" w:fill="F2F5F8"/>
+          </w:tcPr>
+          <w:p>
+            <w:r>
+              <w:rPr>
+                <w:b w:val="0"/>
+                <w:sz w:val="16"/>
+              </w:rPr>
+              <w:t>Cooling / HVAC</w:t>
+            </w:r>
+          </w:p>
+        </w:tc>
+      </w:tr>
+      <w:tr>
+        <w:tc>
+          <w:tcPr>
+            <w:tcW w:type="dxa" w:w="3173"/>
+            <w:shd w:val="clear" w:color="auto" w:fill="FFFFFF"/>
+          </w:tcPr>
+          <w:p>
+            <w:pPr>
+              <w:jc w:val="center"/>
+            </w:pPr>
+            <w:r>
+              <w:rPr>
+                <w:b/>
+                <w:color w:val="00A8CC"/>
+                <w:sz w:val="16"/>
+              </w:rPr>
+              <w:t>I35</w:t>
+            </w:r>
+          </w:p>
+        </w:tc>
+        <w:tc>
+          <w:tcPr>
+            <w:tcW w:type="dxa" w:w="3173"/>
+            <w:shd w:val="clear" w:color="auto" w:fill="FFFFFF"/>
+          </w:tcPr>
+          <w:p>
+            <w:r>
+              <w:rPr>
+                <w:b w:val="0"/>
+                <w:sz w:val="16"/>
+              </w:rPr>
+              <w:t>Design Engineer</w:t>
+            </w:r>
+          </w:p>
+        </w:tc>
+        <w:tc>
+          <w:tcPr>
+            <w:tcW w:type="dxa" w:w="3173"/>
+            <w:shd w:val="clear" w:color="auto" w:fill="FFFFFF"/>
+          </w:tcPr>
+          <w:p>
+            <w:r>
+              <w:rPr>
+                <w:b w:val="0"/>
+                <w:sz w:val="16"/>
+              </w:rPr>
+              <w:t>Manufacturing Machinery</w:t>
+            </w:r>
+          </w:p>
+        </w:tc>
+      </w:tr>
+      <w:tr>
+        <w:tc>
+          <w:tcPr>
+            <w:tcW w:type="dxa" w:w="3173"/>
+            <w:shd w:val="clear" w:color="auto" w:fill="F2F5F8"/>
+          </w:tcPr>
+          <w:p>
+            <w:pPr>
+              <w:jc w:val="center"/>
+            </w:pPr>
+            <w:r>
+              <w:rPr>
+                <w:b/>
+                <w:color w:val="00A8CC"/>
+                <w:sz w:val="16"/>
+              </w:rPr>
+              <w:t>I36</w:t>
+            </w:r>
+          </w:p>
+        </w:tc>
+        <w:tc>
+          <w:tcPr>
+            <w:tcW w:type="dxa" w:w="3173"/>
+            <w:shd w:val="clear" w:color="auto" w:fill="F2F5F8"/>
+          </w:tcPr>
+          <w:p>
+            <w:r>
+              <w:rPr>
+                <w:b w:val="0"/>
+                <w:sz w:val="16"/>
+              </w:rPr>
+              <w:t>CEO</w:t>
+            </w:r>
+          </w:p>
+        </w:tc>
+        <w:tc>
+          <w:tcPr>
+            <w:tcW w:type="dxa" w:w="3173"/>
+            <w:shd w:val="clear" w:color="auto" w:fill="F2F5F8"/>
+          </w:tcPr>
+          <w:p>
+            <w:r>
+              <w:rPr>
+                <w:b w:val="0"/>
+                <w:sz w:val="16"/>
+              </w:rPr>
+              <w:t>Manufacturing Machinery</w:t>
+            </w:r>
+          </w:p>
+        </w:tc>
+      </w:tr>
+      <w:tr>
+        <w:tc>
+          <w:tcPr>
+            <w:tcW w:type="dxa" w:w="3173"/>
+            <w:shd w:val="clear" w:color="auto" w:fill="FFFFFF"/>
+          </w:tcPr>
+          <w:p>
+            <w:pPr>
+              <w:jc w:val="center"/>
+            </w:pPr>
+            <w:r>
+              <w:rPr>
+                <w:b/>
+                <w:color w:val="00A8CC"/>
+                <w:sz w:val="16"/>
+              </w:rPr>
+              <w:t>I37</w:t>
+            </w:r>
+          </w:p>
+        </w:tc>
+        <w:tc>
+          <w:tcPr>
+            <w:tcW w:type="dxa" w:w="3173"/>
+            <w:shd w:val="clear" w:color="auto" w:fill="FFFFFF"/>
+          </w:tcPr>
+          <w:p>
+            <w:r>
+              <w:rPr>
+                <w:b w:val="0"/>
+                <w:sz w:val="16"/>
+              </w:rPr>
+              <w:t>Master of Engineering</w:t>
+            </w:r>
+          </w:p>
+        </w:tc>
+        <w:tc>
+          <w:tcPr>
+            <w:tcW w:type="dxa" w:w="3173"/>
+            <w:shd w:val="clear" w:color="auto" w:fill="FFFFFF"/>
+          </w:tcPr>
+          <w:p>
+            <w:r>
+              <w:rPr>
+                <w:b w:val="0"/>
+                <w:sz w:val="16"/>
+              </w:rPr>
+              <w:t>Battery / Energy</w:t>
+            </w:r>
+          </w:p>
+        </w:tc>
+      </w:tr>
+      <w:tr>
+        <w:tc>
+          <w:tcPr>
+            <w:tcW w:type="dxa" w:w="3173"/>
+            <w:shd w:val="clear" w:color="auto" w:fill="F2F5F8"/>
+          </w:tcPr>
+          <w:p>
+            <w:pPr>
+              <w:jc w:val="center"/>
+            </w:pPr>
+            <w:r>
+              <w:rPr>
+                <w:b/>
+                <w:color w:val="00A8CC"/>
+                <w:sz w:val="16"/>
+              </w:rPr>
+              <w:t>I38</w:t>
+            </w:r>
+          </w:p>
+        </w:tc>
+        <w:tc>
+          <w:tcPr>
+            <w:tcW w:type="dxa" w:w="3173"/>
+            <w:shd w:val="clear" w:color="auto" w:fill="F2F5F8"/>
+          </w:tcPr>
+          <w:p>
+            <w:r>
+              <w:rPr>
+                <w:b w:val="0"/>
+                <w:sz w:val="16"/>
+              </w:rPr>
+              <w:t>SVP Design &amp; Engineering</w:t>
+            </w:r>
+          </w:p>
+        </w:tc>
+        <w:tc>
+          <w:tcPr>
+            <w:tcW w:type="dxa" w:w="3173"/>
+            <w:shd w:val="clear" w:color="auto" w:fill="F2F5F8"/>
+          </w:tcPr>
+          <w:p>
+            <w:r>
+              <w:rPr>
+                <w:b w:val="0"/>
+                <w:sz w:val="16"/>
+              </w:rPr>
+              <w:t>Tooling</w:t>
+            </w:r>
+          </w:p>
+        </w:tc>
+      </w:tr>
+      <w:tr>
+        <w:tc>
+          <w:tcPr>
+            <w:tcW w:type="dxa" w:w="3173"/>
+            <w:shd w:val="clear" w:color="auto" w:fill="FFFFFF"/>
+          </w:tcPr>
+          <w:p>
+            <w:pPr>
+              <w:jc w:val="center"/>
+            </w:pPr>
+            <w:r>
+              <w:rPr>
+                <w:b/>
+                <w:color w:val="00A8CC"/>
+                <w:sz w:val="16"/>
+              </w:rPr>
+              <w:t>I39</w:t>
+            </w:r>
+          </w:p>
+        </w:tc>
+        <w:tc>
+          <w:tcPr>
+            <w:tcW w:type="dxa" w:w="3173"/>
+            <w:shd w:val="clear" w:color="auto" w:fill="FFFFFF"/>
+          </w:tcPr>
+          <w:p>
+            <w:r>
+              <w:rPr>
+                <w:b w:val="0"/>
+                <w:sz w:val="16"/>
+              </w:rPr>
+              <w:t>R&amp;D Engineer</w:t>
+            </w:r>
+          </w:p>
+        </w:tc>
+        <w:tc>
+          <w:tcPr>
+            <w:tcW w:type="dxa" w:w="3173"/>
+            <w:shd w:val="clear" w:color="auto" w:fill="FFFFFF"/>
+          </w:tcPr>
+          <w:p>
+            <w:r>
+              <w:rPr>
+                <w:b w:val="0"/>
+                <w:sz w:val="16"/>
+              </w:rPr>
+              <w:t>Automotive</w:t>
+            </w:r>
+          </w:p>
+        </w:tc>
+      </w:tr>
+      <w:tr>
+        <w:tc>
+          <w:tcPr>
+            <w:tcW w:type="dxa" w:w="3173"/>
+            <w:shd w:val="clear" w:color="auto" w:fill="F2F5F8"/>
+          </w:tcPr>
+          <w:p>
+            <w:pPr>
+              <w:jc w:val="center"/>
+            </w:pPr>
+            <w:r>
+              <w:rPr>
+                <w:b/>
+                <w:color w:val="00A8CC"/>
+                <w:sz w:val="16"/>
+              </w:rPr>
+              <w:t>I40</w:t>
+            </w:r>
+          </w:p>
+        </w:tc>
+        <w:tc>
+          <w:tcPr>
+            <w:tcW w:type="dxa" w:w="3173"/>
+            <w:shd w:val="clear" w:color="auto" w:fill="F2F5F8"/>
+          </w:tcPr>
+          <w:p>
+            <w:r>
+              <w:rPr>
+                <w:b w:val="0"/>
+                <w:sz w:val="16"/>
+              </w:rPr>
+              <w:t>Product Designer</w:t>
+            </w:r>
+          </w:p>
+        </w:tc>
+        <w:tc>
+          <w:tcPr>
+            <w:tcW w:type="dxa" w:w="3173"/>
+            <w:shd w:val="clear" w:color="auto" w:fill="F2F5F8"/>
+          </w:tcPr>
+          <w:p>
+            <w:r>
+              <w:rPr>
+                <w:b w:val="0"/>
+                <w:sz w:val="16"/>
+              </w:rPr>
+              <w:t>Product Design</w:t>
+            </w:r>
+          </w:p>
+        </w:tc>
+      </w:tr>
+      <w:tr>
+        <w:tc>
+          <w:tcPr>
+            <w:tcW w:type="dxa" w:w="3173"/>
+            <w:shd w:val="clear" w:color="auto" w:fill="FFFFFF"/>
+          </w:tcPr>
+          <w:p>
+            <w:pPr>
+              <w:jc w:val="center"/>
+            </w:pPr>
+            <w:r>
+              <w:rPr>
+                <w:b/>
+                <w:color w:val="00A8CC"/>
+                <w:sz w:val="16"/>
+              </w:rPr>
+              <w:t>I41</w:t>
+            </w:r>
+          </w:p>
+        </w:tc>
+        <w:tc>
+          <w:tcPr>
+            <w:tcW w:type="dxa" w:w="3173"/>
+            <w:shd w:val="clear" w:color="auto" w:fill="FFFFFF"/>
+          </w:tcPr>
+          <w:p>
+            <w:r>
+              <w:rPr>
+                <w:b w:val="0"/>
+                <w:sz w:val="16"/>
+              </w:rPr>
+              <w:t>Design Engineer</w:t>
+            </w:r>
+          </w:p>
+        </w:tc>
+        <w:tc>
+          <w:tcPr>
+            <w:tcW w:type="dxa" w:w="3173"/>
+            <w:shd w:val="clear" w:color="auto" w:fill="FFFFFF"/>
+          </w:tcPr>
+          <w:p>
+            <w:r>
+              <w:rPr>
+                <w:b w:val="0"/>
+                <w:sz w:val="16"/>
+              </w:rPr>
+              <w:t>Aerospace</w:t>
+            </w:r>
+          </w:p>
+        </w:tc>
+      </w:tr>
+      <w:tr>
+        <w:tc>
+          <w:tcPr>
+            <w:tcW w:type="dxa" w:w="3173"/>
+            <w:shd w:val="clear" w:color="auto" w:fill="F2F5F8"/>
+          </w:tcPr>
+          <w:p>
+            <w:pPr>
+              <w:jc w:val="center"/>
+            </w:pPr>
+            <w:r>
+              <w:rPr>
+                <w:b/>
+                <w:color w:val="00A8CC"/>
+                <w:sz w:val="16"/>
+              </w:rPr>
+              <w:t>I42</w:t>
+            </w:r>
+          </w:p>
+        </w:tc>
+        <w:tc>
+          <w:tcPr>
+            <w:tcW w:type="dxa" w:w="3173"/>
+            <w:shd w:val="clear" w:color="auto" w:fill="F2F5F8"/>
+          </w:tcPr>
+          <w:p>
+            <w:r>
+              <w:rPr>
+                <w:b w:val="0"/>
+                <w:sz w:val="16"/>
+              </w:rPr>
+              <w:t>Repair Design Engineer</w:t>
+            </w:r>
+          </w:p>
+        </w:tc>
+        <w:tc>
+          <w:tcPr>
+            <w:tcW w:type="dxa" w:w="3173"/>
+            <w:shd w:val="clear" w:color="auto" w:fill="F2F5F8"/>
+          </w:tcPr>
+          <w:p>
+            <w:r>
+              <w:rPr>
+                <w:b w:val="0"/>
+                <w:sz w:val="16"/>
+              </w:rPr>
+              <w:t>Aerospace</w:t>
+            </w:r>
+          </w:p>
+        </w:tc>
+      </w:tr>
+      <w:tr>
+        <w:tc>
+          <w:tcPr>
+            <w:tcW w:type="dxa" w:w="3173"/>
+            <w:shd w:val="clear" w:color="auto" w:fill="FFFFFF"/>
+          </w:tcPr>
+          <w:p>
+            <w:pPr>
+              <w:jc w:val="center"/>
+            </w:pPr>
+            <w:r>
+              <w:rPr>
+                <w:b/>
+                <w:color w:val="00A8CC"/>
+                <w:sz w:val="16"/>
+              </w:rPr>
+              <w:t>I43</w:t>
+            </w:r>
+          </w:p>
+        </w:tc>
+        <w:tc>
+          <w:tcPr>
+            <w:tcW w:type="dxa" w:w="3173"/>
+            <w:shd w:val="clear" w:color="auto" w:fill="FFFFFF"/>
+          </w:tcPr>
+          <w:p>
+            <w:r>
+              <w:rPr>
+                <w:b w:val="0"/>
+                <w:sz w:val="16"/>
+              </w:rPr>
+              <w:t>Program Manager Product Sustainability</w:t>
+            </w:r>
+          </w:p>
+        </w:tc>
+        <w:tc>
+          <w:tcPr>
+            <w:tcW w:type="dxa" w:w="3173"/>
+            <w:shd w:val="clear" w:color="auto" w:fill="FFFFFF"/>
+          </w:tcPr>
+          <w:p>
+            <w:r>
+              <w:rPr>
+                <w:b w:val="0"/>
+                <w:sz w:val="16"/>
+              </w:rPr>
+              <w:t>Material Handling</w:t>
+            </w:r>
+          </w:p>
+        </w:tc>
+      </w:tr>
+      <w:tr>
+        <w:tc>
+          <w:tcPr>
+            <w:tcW w:type="dxa" w:w="3173"/>
+            <w:shd w:val="clear" w:color="auto" w:fill="F2F5F8"/>
+          </w:tcPr>
+          <w:p>
+            <w:pPr>
+              <w:jc w:val="center"/>
+            </w:pPr>
+            <w:r>
+              <w:rPr>
+                <w:b/>
+                <w:color w:val="00A8CC"/>
+                <w:sz w:val="16"/>
+              </w:rPr>
+              <w:t>I44</w:t>
+            </w:r>
+          </w:p>
+        </w:tc>
+        <w:tc>
+          <w:tcPr>
+            <w:tcW w:type="dxa" w:w="3173"/>
+            <w:shd w:val="clear" w:color="auto" w:fill="F2F5F8"/>
+          </w:tcPr>
+          <w:p>
+            <w:r>
+              <w:rPr>
+                <w:b w:val="0"/>
+                <w:sz w:val="16"/>
+              </w:rPr>
+              <w:t>Head of Product Management</w:t>
+            </w:r>
+          </w:p>
+        </w:tc>
+        <w:tc>
+          <w:tcPr>
+            <w:tcW w:type="dxa" w:w="3173"/>
+            <w:shd w:val="clear" w:color="auto" w:fill="F2F5F8"/>
+          </w:tcPr>
+          <w:p>
+            <w:r>
+              <w:rPr>
+                <w:b w:val="0"/>
+                <w:sz w:val="16"/>
+              </w:rPr>
+              <w:t>Material Handling</w:t>
+            </w:r>
+          </w:p>
+        </w:tc>
+      </w:tr>
+    </w:tbl>
+    <w:p>
+      <w:pPr>
+        <w:spacing w:before="0" w:after="160"/>
+      </w:pPr>
+    </w:p>
+    <w:p>
+      <w:pPr>
+        <w:pStyle w:val="Heading2"/>
+        <w:spacing w:before="160" w:after="60"/>
+      </w:pPr>
+      <w:r>
+        <w:rPr>
+          <w:color w:val="1A5F8A"/>
+          <w:sz w:val="22"/>
+        </w:rPr>
+        <w:t>6.2  Industry Distribution of Interviewees</w:t>
+      </w:r>
+    </w:p>
+    <w:p>
+      <w:pPr>
+        <w:spacing w:before="0" w:after="80"/>
+      </w:pPr>
+      <w:r>
+        <w:rPr>
+          <w:b w:val="0"/>
+          <w:color w:val="1A1A2E"/>
+          <w:sz w:val="20"/>
+        </w:rPr>
+        <w:t>The 44 interviews span 16 distinct industries. The sample is intentionally broad to validate that the identified barriers are systemic rather than sector-specific. The two largest groups — Automotive OEM/Suppliers and Engineering Services — together account for 31.8% of interviews, grounding the findings in high-complexity, high-volume discrete manufacturing contexts directly relevant to LFL's target market.</w:t>
+      </w:r>
+    </w:p>
+    <w:tbl>
+      <w:tblPr>
+        <w:tblStyle w:val="TableGrid"/>
+        <w:tblW w:type="auto" w:w="0"/>
+        <w:jc w:val="center"/>
+        <w:tblLook w:firstColumn="1" w:firstRow="1" w:lastColumn="0" w:lastRow="0" w:noHBand="0" w:noVBand="1" w:val="04A0"/>
+      </w:tblPr>
+      <w:tblGrid>
+        <w:gridCol w:w="1904"/>
+        <w:gridCol w:w="1904"/>
+        <w:gridCol w:w="1904"/>
+        <w:gridCol w:w="1904"/>
+        <w:gridCol w:w="1904"/>
+      </w:tblGrid>
+      <w:tr>
+        <w:tc>
+          <w:tcPr>
+            <w:tcW w:type="dxa" w:w="2438"/>
+            <w:shd w:val="clear" w:color="auto" w:fill="0D2B4A"/>
+          </w:tcPr>
+          <w:p>
+            <w:pPr>
+              <w:jc w:val="center"/>
+            </w:pPr>
+            <w:r>
+              <w:rPr>
+                <w:b/>
+                <w:color w:val="FFFFFF"/>
+                <w:sz w:val="16"/>
+              </w:rPr>
+              <w:t>Industry Sector</w:t>
+            </w:r>
+          </w:p>
+        </w:tc>
+        <w:tc>
+          <w:tcPr>
+            <w:tcW w:type="dxa" w:w="850"/>
+            <w:shd w:val="clear" w:color="auto" w:fill="0D2B4A"/>
+          </w:tcPr>
+          <w:p>
+            <w:pPr>
+              <w:jc w:val="center"/>
+            </w:pPr>
+            <w:r>
+              <w:rPr>
+                <w:b/>
+                <w:color w:val="FFFFFF"/>
+                <w:sz w:val="16"/>
+              </w:rPr>
+              <w:t># Inter-</w:t>
+              <w:br/>
+              <w:t>viewees</w:t>
+            </w:r>
+          </w:p>
+        </w:tc>
+        <w:tc>
+          <w:tcPr>
+            <w:tcW w:type="dxa" w:w="794"/>
+            <w:shd w:val="clear" w:color="auto" w:fill="0D2B4A"/>
+          </w:tcPr>
+          <w:p>
+            <w:pPr>
+              <w:jc w:val="center"/>
+            </w:pPr>
+            <w:r>
+              <w:rPr>
+                <w:b/>
+                <w:color w:val="FFFFFF"/>
+                <w:sz w:val="16"/>
+              </w:rPr>
+              <w:t>Share</w:t>
+            </w:r>
+          </w:p>
+        </w:tc>
+        <w:tc>
+          <w:tcPr>
+            <w:tcW w:type="dxa" w:w="2154"/>
+            <w:shd w:val="clear" w:color="auto" w:fill="0D2B4A"/>
+          </w:tcPr>
+          <w:p>
+            <w:pPr>
+              <w:jc w:val="center"/>
+            </w:pPr>
+            <w:r>
+              <w:rPr>
+                <w:b/>
+                <w:color w:val="FFFFFF"/>
+                <w:sz w:val="16"/>
+              </w:rPr>
+              <w:t>Interviewee Codes</w:t>
+            </w:r>
+          </w:p>
+        </w:tc>
+        <w:tc>
+          <w:tcPr>
+            <w:tcW w:type="dxa" w:w="3572"/>
+            <w:shd w:val="clear" w:color="auto" w:fill="0D2B4A"/>
+          </w:tcPr>
+          <w:p>
+            <w:pPr>
+              <w:jc w:val="center"/>
+            </w:pPr>
+            <w:r>
+              <w:rPr>
+                <w:b/>
+                <w:color w:val="FFFFFF"/>
+                <w:sz w:val="16"/>
+              </w:rPr>
+              <w:t>Key Roles Represented</w:t>
+            </w:r>
+          </w:p>
+        </w:tc>
+      </w:tr>
+      <w:tr>
+        <w:tc>
+          <w:tcPr>
+            <w:tcW w:type="dxa" w:w="1904"/>
+            <w:shd w:val="clear" w:color="auto" w:fill="FFFFFF"/>
+          </w:tcPr>
+          <w:p>
+            <w:r>
+              <w:rPr>
+                <w:b w:val="0"/>
+                <w:sz w:val="16"/>
+              </w:rPr>
+              <w:t>Automotive (OEM &amp; Tier-1 Suppliers)</w:t>
+            </w:r>
+          </w:p>
+        </w:tc>
+        <w:tc>
+          <w:tcPr>
+            <w:tcW w:type="dxa" w:w="1904"/>
+            <w:shd w:val="clear" w:color="auto" w:fill="FFFFFF"/>
+          </w:tcPr>
+          <w:p>
+            <w:pPr>
+              <w:jc w:val="center"/>
+            </w:pPr>
+            <w:r>
+              <w:rPr>
+                <w:b w:val="0"/>
+                <w:sz w:val="16"/>
+              </w:rPr>
+              <w:t>7</w:t>
+            </w:r>
+          </w:p>
+        </w:tc>
+        <w:tc>
+          <w:tcPr>
+            <w:tcW w:type="dxa" w:w="1904"/>
+            <w:shd w:val="clear" w:color="auto" w:fill="FFFFFF"/>
+          </w:tcPr>
+          <w:p>
+            <w:pPr>
+              <w:jc w:val="center"/>
+            </w:pPr>
+            <w:r>
+              <w:rPr>
+                <w:b w:val="0"/>
+                <w:sz w:val="16"/>
+              </w:rPr>
+              <w:t>15.9%</w:t>
+            </w:r>
+          </w:p>
+        </w:tc>
+        <w:tc>
+          <w:tcPr>
+            <w:tcW w:type="dxa" w:w="1904"/>
+            <w:shd w:val="clear" w:color="auto" w:fill="FFFFFF"/>
+          </w:tcPr>
+          <w:p>
+            <w:r>
+              <w:rPr>
+                <w:b w:val="0"/>
+                <w:color w:val="1A5F8A"/>
+                <w:sz w:val="15"/>
+              </w:rPr>
+              <w:t>I8, I20, I24, I25, I27, I29, I39</w:t>
+            </w:r>
+          </w:p>
+        </w:tc>
+        <w:tc>
+          <w:tcPr>
+            <w:tcW w:type="dxa" w:w="1904"/>
+            <w:shd w:val="clear" w:color="auto" w:fill="FFFFFF"/>
+          </w:tcPr>
+          <w:p>
+            <w:r>
+              <w:rPr>
+                <w:b w:val="0"/>
+                <w:sz w:val="15"/>
+              </w:rPr>
+              <w:t>Process/Design Engineers, R&amp;D, Team Leads, SVP</w:t>
+            </w:r>
+          </w:p>
+        </w:tc>
+      </w:tr>
+      <w:tr>
+        <w:tc>
+          <w:tcPr>
+            <w:tcW w:type="dxa" w:w="1904"/>
+            <w:shd w:val="clear" w:color="auto" w:fill="F2F5F8"/>
+          </w:tcPr>
+          <w:p>
+            <w:r>
+              <w:rPr>
+                <w:b w:val="0"/>
+                <w:sz w:val="16"/>
+              </w:rPr>
+              <w:t>Engineering Services</w:t>
+            </w:r>
+          </w:p>
+        </w:tc>
+        <w:tc>
+          <w:tcPr>
+            <w:tcW w:type="dxa" w:w="1904"/>
+            <w:shd w:val="clear" w:color="auto" w:fill="F2F5F8"/>
+          </w:tcPr>
+          <w:p>
+            <w:pPr>
+              <w:jc w:val="center"/>
+            </w:pPr>
+            <w:r>
+              <w:rPr>
+                <w:b w:val="0"/>
+                <w:sz w:val="16"/>
+              </w:rPr>
+              <w:t>7</w:t>
+            </w:r>
+          </w:p>
+        </w:tc>
+        <w:tc>
+          <w:tcPr>
+            <w:tcW w:type="dxa" w:w="1904"/>
+            <w:shd w:val="clear" w:color="auto" w:fill="F2F5F8"/>
+          </w:tcPr>
+          <w:p>
+            <w:pPr>
+              <w:jc w:val="center"/>
+            </w:pPr>
+            <w:r>
+              <w:rPr>
+                <w:b w:val="0"/>
+                <w:sz w:val="16"/>
+              </w:rPr>
+              <w:t>15.9%</w:t>
+            </w:r>
+          </w:p>
+        </w:tc>
+        <w:tc>
+          <w:tcPr>
+            <w:tcW w:type="dxa" w:w="1904"/>
+            <w:shd w:val="clear" w:color="auto" w:fill="F2F5F8"/>
+          </w:tcPr>
+          <w:p>
+            <w:r>
+              <w:rPr>
+                <w:b w:val="0"/>
+                <w:color w:val="1A5F8A"/>
+                <w:sz w:val="15"/>
+              </w:rPr>
+              <w:t>I3, I11, I13, I19, I21, I23, I28</w:t>
+            </w:r>
+          </w:p>
+        </w:tc>
+        <w:tc>
+          <w:tcPr>
+            <w:tcW w:type="dxa" w:w="1904"/>
+            <w:shd w:val="clear" w:color="auto" w:fill="F2F5F8"/>
+          </w:tcPr>
+          <w:p>
+            <w:r>
+              <w:rPr>
+                <w:b w:val="0"/>
+                <w:sz w:val="15"/>
+              </w:rPr>
+              <w:t>Designers, Engineers, Co-Founders</w:t>
+            </w:r>
+          </w:p>
+        </w:tc>
+      </w:tr>
+      <w:tr>
+        <w:tc>
+          <w:tcPr>
+            <w:tcW w:type="dxa" w:w="1904"/>
+            <w:shd w:val="clear" w:color="auto" w:fill="FFFFFF"/>
+          </w:tcPr>
+          <w:p>
+            <w:r>
+              <w:rPr>
+                <w:b w:val="0"/>
+                <w:sz w:val="16"/>
+              </w:rPr>
+              <w:t>Engineering &amp; Production Software</w:t>
+            </w:r>
+          </w:p>
+        </w:tc>
+        <w:tc>
+          <w:tcPr>
+            <w:tcW w:type="dxa" w:w="1904"/>
+            <w:shd w:val="clear" w:color="auto" w:fill="FFFFFF"/>
+          </w:tcPr>
+          <w:p>
+            <w:pPr>
+              <w:jc w:val="center"/>
+            </w:pPr>
+            <w:r>
+              <w:rPr>
+                <w:b w:val="0"/>
+                <w:sz w:val="16"/>
+              </w:rPr>
+              <w:t>5</w:t>
+            </w:r>
+          </w:p>
+        </w:tc>
+        <w:tc>
+          <w:tcPr>
+            <w:tcW w:type="dxa" w:w="1904"/>
+            <w:shd w:val="clear" w:color="auto" w:fill="FFFFFF"/>
+          </w:tcPr>
+          <w:p>
+            <w:pPr>
+              <w:jc w:val="center"/>
+            </w:pPr>
+            <w:r>
+              <w:rPr>
+                <w:b w:val="0"/>
+                <w:sz w:val="16"/>
+              </w:rPr>
+              <w:t>11.4%</w:t>
+            </w:r>
+          </w:p>
+        </w:tc>
+        <w:tc>
+          <w:tcPr>
+            <w:tcW w:type="dxa" w:w="1904"/>
+            <w:shd w:val="clear" w:color="auto" w:fill="FFFFFF"/>
+          </w:tcPr>
+          <w:p>
+            <w:r>
+              <w:rPr>
+                <w:b w:val="0"/>
+                <w:color w:val="1A5F8A"/>
+                <w:sz w:val="15"/>
+              </w:rPr>
+              <w:t>I1, I2, I6, I7, I30</w:t>
+            </w:r>
+          </w:p>
+        </w:tc>
+        <w:tc>
+          <w:tcPr>
+            <w:tcW w:type="dxa" w:w="1904"/>
+            <w:shd w:val="clear" w:color="auto" w:fill="FFFFFF"/>
+          </w:tcPr>
+          <w:p>
+            <w:r>
+              <w:rPr>
+                <w:b w:val="0"/>
+                <w:sz w:val="15"/>
+              </w:rPr>
+              <w:t>Consultants, Founders, Investors</w:t>
+            </w:r>
+          </w:p>
+        </w:tc>
+      </w:tr>
+      <w:tr>
+        <w:tc>
+          <w:tcPr>
+            <w:tcW w:type="dxa" w:w="1904"/>
+            <w:shd w:val="clear" w:color="auto" w:fill="F2F5F8"/>
+          </w:tcPr>
+          <w:p>
+            <w:r>
+              <w:rPr>
+                <w:b w:val="0"/>
+                <w:sz w:val="16"/>
+              </w:rPr>
+              <w:t>Electronics OEM</w:t>
+            </w:r>
+          </w:p>
+        </w:tc>
+        <w:tc>
+          <w:tcPr>
+            <w:tcW w:type="dxa" w:w="1904"/>
+            <w:shd w:val="clear" w:color="auto" w:fill="F2F5F8"/>
+          </w:tcPr>
+          <w:p>
+            <w:pPr>
+              <w:jc w:val="center"/>
+            </w:pPr>
+            <w:r>
+              <w:rPr>
+                <w:b w:val="0"/>
+                <w:sz w:val="16"/>
+              </w:rPr>
+              <w:t>5</w:t>
+            </w:r>
+          </w:p>
+        </w:tc>
+        <w:tc>
+          <w:tcPr>
+            <w:tcW w:type="dxa" w:w="1904"/>
+            <w:shd w:val="clear" w:color="auto" w:fill="F2F5F8"/>
+          </w:tcPr>
+          <w:p>
+            <w:pPr>
+              <w:jc w:val="center"/>
+            </w:pPr>
+            <w:r>
+              <w:rPr>
+                <w:b w:val="0"/>
+                <w:sz w:val="16"/>
+              </w:rPr>
+              <w:t>11.4%</w:t>
+            </w:r>
+          </w:p>
+        </w:tc>
+        <w:tc>
+          <w:tcPr>
+            <w:tcW w:type="dxa" w:w="1904"/>
+            <w:shd w:val="clear" w:color="auto" w:fill="F2F5F8"/>
+          </w:tcPr>
+          <w:p>
+            <w:r>
+              <w:rPr>
+                <w:b w:val="0"/>
+                <w:color w:val="1A5F8A"/>
+                <w:sz w:val="15"/>
+              </w:rPr>
+              <w:t>I5, I10, I17, I22, I26</w:t>
+            </w:r>
+          </w:p>
+        </w:tc>
+        <w:tc>
+          <w:tcPr>
+            <w:tcW w:type="dxa" w:w="1904"/>
+            <w:shd w:val="clear" w:color="auto" w:fill="F2F5F8"/>
+          </w:tcPr>
+          <w:p>
+            <w:r>
+              <w:rPr>
+                <w:b w:val="0"/>
+                <w:sz w:val="15"/>
+              </w:rPr>
+              <w:t>CEOs, GMs, R&amp;D Heads, PMs, Team Leads</w:t>
+            </w:r>
+          </w:p>
+        </w:tc>
+      </w:tr>
+      <w:tr>
+        <w:tc>
+          <w:tcPr>
+            <w:tcW w:type="dxa" w:w="1904"/>
+            <w:shd w:val="clear" w:color="auto" w:fill="FFFFFF"/>
+          </w:tcPr>
+          <w:p>
+            <w:r>
+              <w:rPr>
+                <w:b w:val="0"/>
+                <w:sz w:val="16"/>
+              </w:rPr>
+              <w:t>Material Handling</w:t>
+            </w:r>
+          </w:p>
+        </w:tc>
+        <w:tc>
+          <w:tcPr>
+            <w:tcW w:type="dxa" w:w="1904"/>
+            <w:shd w:val="clear" w:color="auto" w:fill="FFFFFF"/>
+          </w:tcPr>
+          <w:p>
+            <w:pPr>
+              <w:jc w:val="center"/>
+            </w:pPr>
+            <w:r>
+              <w:rPr>
+                <w:b w:val="0"/>
+                <w:sz w:val="16"/>
+              </w:rPr>
+              <w:t>4</w:t>
+            </w:r>
+          </w:p>
+        </w:tc>
+        <w:tc>
+          <w:tcPr>
+            <w:tcW w:type="dxa" w:w="1904"/>
+            <w:shd w:val="clear" w:color="auto" w:fill="FFFFFF"/>
+          </w:tcPr>
+          <w:p>
+            <w:pPr>
+              <w:jc w:val="center"/>
+            </w:pPr>
+            <w:r>
+              <w:rPr>
+                <w:b w:val="0"/>
+                <w:sz w:val="16"/>
+              </w:rPr>
+              <w:t>9.1%</w:t>
+            </w:r>
+          </w:p>
+        </w:tc>
+        <w:tc>
+          <w:tcPr>
+            <w:tcW w:type="dxa" w:w="1904"/>
+            <w:shd w:val="clear" w:color="auto" w:fill="FFFFFF"/>
+          </w:tcPr>
+          <w:p>
+            <w:r>
+              <w:rPr>
+                <w:b w:val="0"/>
+                <w:color w:val="1A5F8A"/>
+                <w:sz w:val="15"/>
+              </w:rPr>
+              <w:t>I31, I32, I43, I44</w:t>
+            </w:r>
+          </w:p>
+        </w:tc>
+        <w:tc>
+          <w:tcPr>
+            <w:tcW w:type="dxa" w:w="1904"/>
+            <w:shd w:val="clear" w:color="auto" w:fill="FFFFFF"/>
+          </w:tcPr>
+          <w:p>
+            <w:r>
+              <w:rPr>
+                <w:b w:val="0"/>
+                <w:sz w:val="15"/>
+              </w:rPr>
+              <w:t>Sustainability Mgr, Product Mgr, Head PM, Program Mgr</w:t>
+            </w:r>
+          </w:p>
+        </w:tc>
+      </w:tr>
+      <w:tr>
+        <w:tc>
+          <w:tcPr>
+            <w:tcW w:type="dxa" w:w="1904"/>
+            <w:shd w:val="clear" w:color="auto" w:fill="F2F5F8"/>
+          </w:tcPr>
+          <w:p>
+            <w:r>
+              <w:rPr>
+                <w:b w:val="0"/>
+                <w:sz w:val="16"/>
+              </w:rPr>
+              <w:t>Manufacturing Machinery</w:t>
+            </w:r>
+          </w:p>
+        </w:tc>
+        <w:tc>
+          <w:tcPr>
+            <w:tcW w:type="dxa" w:w="1904"/>
+            <w:shd w:val="clear" w:color="auto" w:fill="F2F5F8"/>
+          </w:tcPr>
+          <w:p>
+            <w:pPr>
+              <w:jc w:val="center"/>
+            </w:pPr>
+            <w:r>
+              <w:rPr>
+                <w:b w:val="0"/>
+                <w:sz w:val="16"/>
+              </w:rPr>
+              <w:t>2</w:t>
+            </w:r>
+          </w:p>
+        </w:tc>
+        <w:tc>
+          <w:tcPr>
+            <w:tcW w:type="dxa" w:w="1904"/>
+            <w:shd w:val="clear" w:color="auto" w:fill="F2F5F8"/>
+          </w:tcPr>
+          <w:p>
+            <w:pPr>
+              <w:jc w:val="center"/>
+            </w:pPr>
+            <w:r>
+              <w:rPr>
+                <w:b w:val="0"/>
+                <w:sz w:val="16"/>
+              </w:rPr>
+              <w:t>4.5%</w:t>
+            </w:r>
+          </w:p>
+        </w:tc>
+        <w:tc>
+          <w:tcPr>
+            <w:tcW w:type="dxa" w:w="1904"/>
+            <w:shd w:val="clear" w:color="auto" w:fill="F2F5F8"/>
+          </w:tcPr>
+          <w:p>
+            <w:r>
+              <w:rPr>
+                <w:b w:val="0"/>
+                <w:color w:val="1A5F8A"/>
+                <w:sz w:val="15"/>
+              </w:rPr>
+              <w:t>I35, I36</w:t>
+            </w:r>
+          </w:p>
+        </w:tc>
+        <w:tc>
+          <w:tcPr>
+            <w:tcW w:type="dxa" w:w="1904"/>
+            <w:shd w:val="clear" w:color="auto" w:fill="F2F5F8"/>
+          </w:tcPr>
+          <w:p>
+            <w:r>
+              <w:rPr>
+                <w:b w:val="0"/>
+                <w:sz w:val="15"/>
+              </w:rPr>
+              <w:t>Design Engineer, CEO</w:t>
+            </w:r>
+          </w:p>
+        </w:tc>
+      </w:tr>
+      <w:tr>
+        <w:tc>
+          <w:tcPr>
+            <w:tcW w:type="dxa" w:w="1904"/>
+            <w:shd w:val="clear" w:color="auto" w:fill="FFFFFF"/>
+          </w:tcPr>
+          <w:p>
+            <w:r>
+              <w:rPr>
+                <w:b w:val="0"/>
+                <w:sz w:val="16"/>
+              </w:rPr>
+              <w:t>Packaging</w:t>
+            </w:r>
+          </w:p>
+        </w:tc>
+        <w:tc>
+          <w:tcPr>
+            <w:tcW w:type="dxa" w:w="1904"/>
+            <w:shd w:val="clear" w:color="auto" w:fill="FFFFFF"/>
+          </w:tcPr>
+          <w:p>
+            <w:pPr>
+              <w:jc w:val="center"/>
+            </w:pPr>
+            <w:r>
+              <w:rPr>
+                <w:b w:val="0"/>
+                <w:sz w:val="16"/>
+              </w:rPr>
+              <w:t>2</w:t>
+            </w:r>
+          </w:p>
+        </w:tc>
+        <w:tc>
+          <w:tcPr>
+            <w:tcW w:type="dxa" w:w="1904"/>
+            <w:shd w:val="clear" w:color="auto" w:fill="FFFFFF"/>
+          </w:tcPr>
+          <w:p>
+            <w:pPr>
+              <w:jc w:val="center"/>
+            </w:pPr>
+            <w:r>
+              <w:rPr>
+                <w:b w:val="0"/>
+                <w:sz w:val="16"/>
+              </w:rPr>
+              <w:t>4.5%</w:t>
+            </w:r>
+          </w:p>
+        </w:tc>
+        <w:tc>
+          <w:tcPr>
+            <w:tcW w:type="dxa" w:w="1904"/>
+            <w:shd w:val="clear" w:color="auto" w:fill="FFFFFF"/>
+          </w:tcPr>
+          <w:p>
+            <w:r>
+              <w:rPr>
+                <w:b w:val="0"/>
+                <w:color w:val="1A5F8A"/>
+                <w:sz w:val="15"/>
+              </w:rPr>
+              <w:t>I4, I14</w:t>
+            </w:r>
+          </w:p>
+        </w:tc>
+        <w:tc>
+          <w:tcPr>
+            <w:tcW w:type="dxa" w:w="1904"/>
+            <w:shd w:val="clear" w:color="auto" w:fill="FFFFFF"/>
+          </w:tcPr>
+          <w:p>
+            <w:r>
+              <w:rPr>
+                <w:b w:val="0"/>
+                <w:sz w:val="15"/>
+              </w:rPr>
+              <w:t>General Manager, Process Engineer</w:t>
+            </w:r>
+          </w:p>
+        </w:tc>
+      </w:tr>
+      <w:tr>
+        <w:tc>
+          <w:tcPr>
+            <w:tcW w:type="dxa" w:w="1904"/>
+            <w:shd w:val="clear" w:color="auto" w:fill="F2F5F8"/>
+          </w:tcPr>
+          <w:p>
+            <w:r>
+              <w:rPr>
+                <w:b w:val="0"/>
+                <w:sz w:val="16"/>
+              </w:rPr>
+              <w:t>Academia</w:t>
+            </w:r>
+          </w:p>
+        </w:tc>
+        <w:tc>
+          <w:tcPr>
+            <w:tcW w:type="dxa" w:w="1904"/>
+            <w:shd w:val="clear" w:color="auto" w:fill="F2F5F8"/>
+          </w:tcPr>
+          <w:p>
+            <w:pPr>
+              <w:jc w:val="center"/>
+            </w:pPr>
+            <w:r>
+              <w:rPr>
+                <w:b w:val="0"/>
+                <w:sz w:val="16"/>
+              </w:rPr>
+              <w:t>2</w:t>
+            </w:r>
+          </w:p>
+        </w:tc>
+        <w:tc>
+          <w:tcPr>
+            <w:tcW w:type="dxa" w:w="1904"/>
+            <w:shd w:val="clear" w:color="auto" w:fill="F2F5F8"/>
+          </w:tcPr>
+          <w:p>
+            <w:pPr>
+              <w:jc w:val="center"/>
+            </w:pPr>
+            <w:r>
+              <w:rPr>
+                <w:b w:val="0"/>
+                <w:sz w:val="16"/>
+              </w:rPr>
+              <w:t>4.5%</w:t>
+            </w:r>
+          </w:p>
+        </w:tc>
+        <w:tc>
+          <w:tcPr>
+            <w:tcW w:type="dxa" w:w="1904"/>
+            <w:shd w:val="clear" w:color="auto" w:fill="F2F5F8"/>
+          </w:tcPr>
+          <w:p>
+            <w:r>
+              <w:rPr>
+                <w:b w:val="0"/>
+                <w:color w:val="1A5F8A"/>
+                <w:sz w:val="15"/>
+              </w:rPr>
+              <w:t>I12, I16</w:t>
+            </w:r>
+          </w:p>
+        </w:tc>
+        <w:tc>
+          <w:tcPr>
+            <w:tcW w:type="dxa" w:w="1904"/>
+            <w:shd w:val="clear" w:color="auto" w:fill="F2F5F8"/>
+          </w:tcPr>
+          <w:p>
+            <w:r>
+              <w:rPr>
+                <w:b w:val="0"/>
+                <w:sz w:val="15"/>
+              </w:rPr>
+              <w:t>Mechanical Engineer, Postdoctoral Researcher</w:t>
+            </w:r>
+          </w:p>
+        </w:tc>
+      </w:tr>
+      <w:tr>
+        <w:tc>
+          <w:tcPr>
+            <w:tcW w:type="dxa" w:w="1904"/>
+            <w:shd w:val="clear" w:color="auto" w:fill="FFFFFF"/>
+          </w:tcPr>
+          <w:p>
+            <w:r>
+              <w:rPr>
+                <w:b w:val="0"/>
+                <w:sz w:val="16"/>
+              </w:rPr>
+              <w:t>Aerospace</w:t>
+            </w:r>
+          </w:p>
+        </w:tc>
+        <w:tc>
+          <w:tcPr>
+            <w:tcW w:type="dxa" w:w="1904"/>
+            <w:shd w:val="clear" w:color="auto" w:fill="FFFFFF"/>
+          </w:tcPr>
+          <w:p>
+            <w:pPr>
+              <w:jc w:val="center"/>
+            </w:pPr>
+            <w:r>
+              <w:rPr>
+                <w:b w:val="0"/>
+                <w:sz w:val="16"/>
+              </w:rPr>
+              <w:t>2</w:t>
+            </w:r>
+          </w:p>
+        </w:tc>
+        <w:tc>
+          <w:tcPr>
+            <w:tcW w:type="dxa" w:w="1904"/>
+            <w:shd w:val="clear" w:color="auto" w:fill="FFFFFF"/>
+          </w:tcPr>
+          <w:p>
+            <w:pPr>
+              <w:jc w:val="center"/>
+            </w:pPr>
+            <w:r>
+              <w:rPr>
+                <w:b w:val="0"/>
+                <w:sz w:val="16"/>
+              </w:rPr>
+              <w:t>4.5%</w:t>
+            </w:r>
+          </w:p>
+        </w:tc>
+        <w:tc>
+          <w:tcPr>
+            <w:tcW w:type="dxa" w:w="1904"/>
+            <w:shd w:val="clear" w:color="auto" w:fill="FFFFFF"/>
+          </w:tcPr>
+          <w:p>
+            <w:r>
+              <w:rPr>
+                <w:b w:val="0"/>
+                <w:color w:val="1A5F8A"/>
+                <w:sz w:val="15"/>
+              </w:rPr>
+              <w:t>I41, I42</w:t>
+            </w:r>
+          </w:p>
+        </w:tc>
+        <w:tc>
+          <w:tcPr>
+            <w:tcW w:type="dxa" w:w="1904"/>
+            <w:shd w:val="clear" w:color="auto" w:fill="FFFFFF"/>
+          </w:tcPr>
+          <w:p>
+            <w:r>
+              <w:rPr>
+                <w:b w:val="0"/>
+                <w:sz w:val="15"/>
+              </w:rPr>
+              <w:t>Design Engineers, Repair Design Engineer</w:t>
+            </w:r>
+          </w:p>
+        </w:tc>
+      </w:tr>
+      <w:tr>
+        <w:tc>
+          <w:tcPr>
+            <w:tcW w:type="dxa" w:w="1904"/>
+            <w:shd w:val="clear" w:color="auto" w:fill="F2F5F8"/>
+          </w:tcPr>
+          <w:p>
+            <w:r>
+              <w:rPr>
+                <w:b w:val="0"/>
+                <w:sz w:val="16"/>
+              </w:rPr>
+              <w:t>Consulting (incl. Sustainability)</w:t>
+            </w:r>
+          </w:p>
+        </w:tc>
+        <w:tc>
+          <w:tcPr>
+            <w:tcW w:type="dxa" w:w="1904"/>
+            <w:shd w:val="clear" w:color="auto" w:fill="F2F5F8"/>
+          </w:tcPr>
+          <w:p>
+            <w:pPr>
+              <w:jc w:val="center"/>
+            </w:pPr>
+            <w:r>
+              <w:rPr>
+                <w:b w:val="0"/>
+                <w:sz w:val="16"/>
+              </w:rPr>
+              <w:t>2</w:t>
+            </w:r>
+          </w:p>
+        </w:tc>
+        <w:tc>
+          <w:tcPr>
+            <w:tcW w:type="dxa" w:w="1904"/>
+            <w:shd w:val="clear" w:color="auto" w:fill="F2F5F8"/>
+          </w:tcPr>
+          <w:p>
+            <w:pPr>
+              <w:jc w:val="center"/>
+            </w:pPr>
+            <w:r>
+              <w:rPr>
+                <w:b w:val="0"/>
+                <w:sz w:val="16"/>
+              </w:rPr>
+              <w:t>4.5%</w:t>
+            </w:r>
+          </w:p>
+        </w:tc>
+        <w:tc>
+          <w:tcPr>
+            <w:tcW w:type="dxa" w:w="1904"/>
+            <w:shd w:val="clear" w:color="auto" w:fill="F2F5F8"/>
+          </w:tcPr>
+          <w:p>
+            <w:r>
+              <w:rPr>
+                <w:b w:val="0"/>
+                <w:color w:val="1A5F8A"/>
+                <w:sz w:val="15"/>
+              </w:rPr>
+              <w:t>I15, I18</w:t>
+            </w:r>
+          </w:p>
+        </w:tc>
+        <w:tc>
+          <w:tcPr>
+            <w:tcW w:type="dxa" w:w="1904"/>
+            <w:shd w:val="clear" w:color="auto" w:fill="F2F5F8"/>
+          </w:tcPr>
+          <w:p>
+            <w:r>
+              <w:rPr>
+                <w:b w:val="0"/>
+                <w:sz w:val="15"/>
+              </w:rPr>
+              <w:t>Senior Director Strategy, Consultant/Founder</w:t>
+            </w:r>
+          </w:p>
+        </w:tc>
+      </w:tr>
+      <w:tr>
+        <w:tc>
+          <w:tcPr>
+            <w:tcW w:type="dxa" w:w="1904"/>
+            <w:shd w:val="clear" w:color="auto" w:fill="FFFFFF"/>
+          </w:tcPr>
+          <w:p>
+            <w:r>
+              <w:rPr>
+                <w:b w:val="0"/>
+                <w:sz w:val="16"/>
+              </w:rPr>
+              <w:t>Building / Infrastructure</w:t>
+            </w:r>
+          </w:p>
+        </w:tc>
+        <w:tc>
+          <w:tcPr>
+            <w:tcW w:type="dxa" w:w="1904"/>
+            <w:shd w:val="clear" w:color="auto" w:fill="FFFFFF"/>
+          </w:tcPr>
+          <w:p>
+            <w:pPr>
+              <w:jc w:val="center"/>
+            </w:pPr>
+            <w:r>
+              <w:rPr>
+                <w:b w:val="0"/>
+                <w:sz w:val="16"/>
+              </w:rPr>
+              <w:t>1</w:t>
+            </w:r>
+          </w:p>
+        </w:tc>
+        <w:tc>
+          <w:tcPr>
+            <w:tcW w:type="dxa" w:w="1904"/>
+            <w:shd w:val="clear" w:color="auto" w:fill="FFFFFF"/>
+          </w:tcPr>
+          <w:p>
+            <w:pPr>
+              <w:jc w:val="center"/>
+            </w:pPr>
+            <w:r>
+              <w:rPr>
+                <w:b w:val="0"/>
+                <w:sz w:val="16"/>
+              </w:rPr>
+              <w:t>2.3%</w:t>
+            </w:r>
+          </w:p>
+        </w:tc>
+        <w:tc>
+          <w:tcPr>
+            <w:tcW w:type="dxa" w:w="1904"/>
+            <w:shd w:val="clear" w:color="auto" w:fill="FFFFFF"/>
+          </w:tcPr>
+          <w:p>
+            <w:r>
+              <w:rPr>
+                <w:b w:val="0"/>
+                <w:color w:val="1A5F8A"/>
+                <w:sz w:val="15"/>
+              </w:rPr>
+              <w:t>I9</w:t>
+            </w:r>
+          </w:p>
+        </w:tc>
+        <w:tc>
+          <w:tcPr>
+            <w:tcW w:type="dxa" w:w="1904"/>
+            <w:shd w:val="clear" w:color="auto" w:fill="FFFFFF"/>
+          </w:tcPr>
+          <w:p>
+            <w:r>
+              <w:rPr>
+                <w:b w:val="0"/>
+                <w:sz w:val="15"/>
+              </w:rPr>
+              <w:t>R&amp;D Head</w:t>
+            </w:r>
+          </w:p>
+        </w:tc>
+      </w:tr>
+      <w:tr>
+        <w:tc>
+          <w:tcPr>
+            <w:tcW w:type="dxa" w:w="1904"/>
+            <w:shd w:val="clear" w:color="auto" w:fill="F2F5F8"/>
+          </w:tcPr>
+          <w:p>
+            <w:r>
+              <w:rPr>
+                <w:b w:val="0"/>
+                <w:sz w:val="16"/>
+              </w:rPr>
+              <w:t>Rail Rolling Stock</w:t>
+            </w:r>
+          </w:p>
+        </w:tc>
+        <w:tc>
+          <w:tcPr>
+            <w:tcW w:type="dxa" w:w="1904"/>
+            <w:shd w:val="clear" w:color="auto" w:fill="F2F5F8"/>
+          </w:tcPr>
+          <w:p>
+            <w:pPr>
+              <w:jc w:val="center"/>
+            </w:pPr>
+            <w:r>
+              <w:rPr>
+                <w:b w:val="0"/>
+                <w:sz w:val="16"/>
+              </w:rPr>
+              <w:t>1</w:t>
+            </w:r>
+          </w:p>
+        </w:tc>
+        <w:tc>
+          <w:tcPr>
+            <w:tcW w:type="dxa" w:w="1904"/>
+            <w:shd w:val="clear" w:color="auto" w:fill="F2F5F8"/>
+          </w:tcPr>
+          <w:p>
+            <w:pPr>
+              <w:jc w:val="center"/>
+            </w:pPr>
+            <w:r>
+              <w:rPr>
+                <w:b w:val="0"/>
+                <w:sz w:val="16"/>
+              </w:rPr>
+              <w:t>2.3%</w:t>
+            </w:r>
+          </w:p>
+        </w:tc>
+        <w:tc>
+          <w:tcPr>
+            <w:tcW w:type="dxa" w:w="1904"/>
+            <w:shd w:val="clear" w:color="auto" w:fill="F2F5F8"/>
+          </w:tcPr>
+          <w:p>
+            <w:r>
+              <w:rPr>
+                <w:b w:val="0"/>
+                <w:color w:val="1A5F8A"/>
+                <w:sz w:val="15"/>
+              </w:rPr>
+              <w:t>I33</w:t>
+            </w:r>
+          </w:p>
+        </w:tc>
+        <w:tc>
+          <w:tcPr>
+            <w:tcW w:type="dxa" w:w="1904"/>
+            <w:shd w:val="clear" w:color="auto" w:fill="F2F5F8"/>
+          </w:tcPr>
+          <w:p>
+            <w:r>
+              <w:rPr>
+                <w:b w:val="0"/>
+                <w:sz w:val="15"/>
+              </w:rPr>
+              <w:t>Product Developer</w:t>
+            </w:r>
+          </w:p>
+        </w:tc>
+      </w:tr>
+      <w:tr>
+        <w:tc>
+          <w:tcPr>
+            <w:tcW w:type="dxa" w:w="1904"/>
+            <w:shd w:val="clear" w:color="auto" w:fill="FFFFFF"/>
+          </w:tcPr>
+          <w:p>
+            <w:r>
+              <w:rPr>
+                <w:b w:val="0"/>
+                <w:sz w:val="16"/>
+              </w:rPr>
+              <w:t>Cooling / HVAC</w:t>
+            </w:r>
+          </w:p>
+        </w:tc>
+        <w:tc>
+          <w:tcPr>
+            <w:tcW w:type="dxa" w:w="1904"/>
+            <w:shd w:val="clear" w:color="auto" w:fill="FFFFFF"/>
+          </w:tcPr>
+          <w:p>
+            <w:pPr>
+              <w:jc w:val="center"/>
+            </w:pPr>
+            <w:r>
+              <w:rPr>
+                <w:b w:val="0"/>
+                <w:sz w:val="16"/>
+              </w:rPr>
+              <w:t>1</w:t>
+            </w:r>
+          </w:p>
+        </w:tc>
+        <w:tc>
+          <w:tcPr>
+            <w:tcW w:type="dxa" w:w="1904"/>
+            <w:shd w:val="clear" w:color="auto" w:fill="FFFFFF"/>
+          </w:tcPr>
+          <w:p>
+            <w:pPr>
+              <w:jc w:val="center"/>
+            </w:pPr>
+            <w:r>
+              <w:rPr>
+                <w:b w:val="0"/>
+                <w:sz w:val="16"/>
+              </w:rPr>
+              <w:t>2.3%</w:t>
+            </w:r>
+          </w:p>
+        </w:tc>
+        <w:tc>
+          <w:tcPr>
+            <w:tcW w:type="dxa" w:w="1904"/>
+            <w:shd w:val="clear" w:color="auto" w:fill="FFFFFF"/>
+          </w:tcPr>
+          <w:p>
+            <w:r>
+              <w:rPr>
+                <w:b w:val="0"/>
+                <w:color w:val="1A5F8A"/>
+                <w:sz w:val="15"/>
+              </w:rPr>
+              <w:t>I34</w:t>
+            </w:r>
+          </w:p>
+        </w:tc>
+        <w:tc>
+          <w:tcPr>
+            <w:tcW w:type="dxa" w:w="1904"/>
+            <w:shd w:val="clear" w:color="auto" w:fill="FFFFFF"/>
+          </w:tcPr>
+          <w:p>
+            <w:r>
+              <w:rPr>
+                <w:b w:val="0"/>
+                <w:sz w:val="15"/>
+              </w:rPr>
+              <w:t>CIO, Software Engineer</w:t>
+            </w:r>
+          </w:p>
+        </w:tc>
+      </w:tr>
+      <w:tr>
+        <w:tc>
+          <w:tcPr>
+            <w:tcW w:type="dxa" w:w="1904"/>
+            <w:shd w:val="clear" w:color="auto" w:fill="F2F5F8"/>
+          </w:tcPr>
+          <w:p>
+            <w:r>
+              <w:rPr>
+                <w:b w:val="0"/>
+                <w:sz w:val="16"/>
+              </w:rPr>
+              <w:t>Battery / Energy</w:t>
+            </w:r>
+          </w:p>
+        </w:tc>
+        <w:tc>
+          <w:tcPr>
+            <w:tcW w:type="dxa" w:w="1904"/>
+            <w:shd w:val="clear" w:color="auto" w:fill="F2F5F8"/>
+          </w:tcPr>
+          <w:p>
+            <w:pPr>
+              <w:jc w:val="center"/>
+            </w:pPr>
+            <w:r>
+              <w:rPr>
+                <w:b w:val="0"/>
+                <w:sz w:val="16"/>
+              </w:rPr>
+              <w:t>1</w:t>
+            </w:r>
+          </w:p>
+        </w:tc>
+        <w:tc>
+          <w:tcPr>
+            <w:tcW w:type="dxa" w:w="1904"/>
+            <w:shd w:val="clear" w:color="auto" w:fill="F2F5F8"/>
+          </w:tcPr>
+          <w:p>
+            <w:pPr>
+              <w:jc w:val="center"/>
+            </w:pPr>
+            <w:r>
+              <w:rPr>
+                <w:b w:val="0"/>
+                <w:sz w:val="16"/>
+              </w:rPr>
+              <w:t>2.3%</w:t>
+            </w:r>
+          </w:p>
+        </w:tc>
+        <w:tc>
+          <w:tcPr>
+            <w:tcW w:type="dxa" w:w="1904"/>
+            <w:shd w:val="clear" w:color="auto" w:fill="F2F5F8"/>
+          </w:tcPr>
+          <w:p>
+            <w:r>
+              <w:rPr>
+                <w:b w:val="0"/>
+                <w:color w:val="1A5F8A"/>
+                <w:sz w:val="15"/>
+              </w:rPr>
+              <w:t>I37</w:t>
+            </w:r>
+          </w:p>
+        </w:tc>
+        <w:tc>
+          <w:tcPr>
+            <w:tcW w:type="dxa" w:w="1904"/>
+            <w:shd w:val="clear" w:color="auto" w:fill="F2F5F8"/>
+          </w:tcPr>
+          <w:p>
+            <w:r>
+              <w:rPr>
+                <w:b w:val="0"/>
+                <w:sz w:val="15"/>
+              </w:rPr>
+              <w:t>Master of Engineering</w:t>
+            </w:r>
+          </w:p>
+        </w:tc>
+      </w:tr>
+      <w:tr>
+        <w:tc>
+          <w:tcPr>
+            <w:tcW w:type="dxa" w:w="1904"/>
+            <w:shd w:val="clear" w:color="auto" w:fill="FFFFFF"/>
+          </w:tcPr>
+          <w:p>
+            <w:r>
+              <w:rPr>
+                <w:b w:val="0"/>
+                <w:sz w:val="16"/>
+              </w:rPr>
+              <w:t>Tooling</w:t>
+            </w:r>
+          </w:p>
+        </w:tc>
+        <w:tc>
+          <w:tcPr>
+            <w:tcW w:type="dxa" w:w="1904"/>
+            <w:shd w:val="clear" w:color="auto" w:fill="FFFFFF"/>
+          </w:tcPr>
+          <w:p>
+            <w:pPr>
+              <w:jc w:val="center"/>
+            </w:pPr>
+            <w:r>
+              <w:rPr>
+                <w:b w:val="0"/>
+                <w:sz w:val="16"/>
+              </w:rPr>
+              <w:t>1</w:t>
+            </w:r>
+          </w:p>
+        </w:tc>
+        <w:tc>
+          <w:tcPr>
+            <w:tcW w:type="dxa" w:w="1904"/>
+            <w:shd w:val="clear" w:color="auto" w:fill="FFFFFF"/>
+          </w:tcPr>
+          <w:p>
+            <w:pPr>
+              <w:jc w:val="center"/>
+            </w:pPr>
+            <w:r>
+              <w:rPr>
+                <w:b w:val="0"/>
+                <w:sz w:val="16"/>
+              </w:rPr>
+              <w:t>2.3%</w:t>
+            </w:r>
+          </w:p>
+        </w:tc>
+        <w:tc>
+          <w:tcPr>
+            <w:tcW w:type="dxa" w:w="1904"/>
+            <w:shd w:val="clear" w:color="auto" w:fill="FFFFFF"/>
+          </w:tcPr>
+          <w:p>
+            <w:r>
+              <w:rPr>
+                <w:b w:val="0"/>
+                <w:color w:val="1A5F8A"/>
+                <w:sz w:val="15"/>
+              </w:rPr>
+              <w:t>I38</w:t>
+            </w:r>
+          </w:p>
+        </w:tc>
+        <w:tc>
+          <w:tcPr>
+            <w:tcW w:type="dxa" w:w="1904"/>
+            <w:shd w:val="clear" w:color="auto" w:fill="FFFFFF"/>
+          </w:tcPr>
+          <w:p>
+            <w:r>
+              <w:rPr>
+                <w:b w:val="0"/>
+                <w:sz w:val="15"/>
+              </w:rPr>
+              <w:t>SVP Design &amp; Engineering</w:t>
+            </w:r>
+          </w:p>
+        </w:tc>
+      </w:tr>
+      <w:tr>
+        <w:tc>
+          <w:tcPr>
+            <w:tcW w:type="dxa" w:w="1904"/>
+            <w:shd w:val="clear" w:color="auto" w:fill="F2F5F8"/>
+          </w:tcPr>
+          <w:p>
+            <w:r>
+              <w:rPr>
+                <w:b w:val="0"/>
+                <w:sz w:val="16"/>
+              </w:rPr>
+              <w:t>Product Design (Consultancy)</w:t>
+            </w:r>
+          </w:p>
+        </w:tc>
+        <w:tc>
+          <w:tcPr>
+            <w:tcW w:type="dxa" w:w="1904"/>
+            <w:shd w:val="clear" w:color="auto" w:fill="F2F5F8"/>
+          </w:tcPr>
+          <w:p>
+            <w:pPr>
+              <w:jc w:val="center"/>
+            </w:pPr>
+            <w:r>
+              <w:rPr>
+                <w:b w:val="0"/>
+                <w:sz w:val="16"/>
+              </w:rPr>
+              <w:t>1</w:t>
+            </w:r>
+          </w:p>
+        </w:tc>
+        <w:tc>
+          <w:tcPr>
+            <w:tcW w:type="dxa" w:w="1904"/>
+            <w:shd w:val="clear" w:color="auto" w:fill="F2F5F8"/>
+          </w:tcPr>
+          <w:p>
+            <w:pPr>
+              <w:jc w:val="center"/>
+            </w:pPr>
+            <w:r>
+              <w:rPr>
+                <w:b w:val="0"/>
+                <w:sz w:val="16"/>
+              </w:rPr>
+              <w:t>2.3%</w:t>
+            </w:r>
+          </w:p>
+        </w:tc>
+        <w:tc>
+          <w:tcPr>
+            <w:tcW w:type="dxa" w:w="1904"/>
+            <w:shd w:val="clear" w:color="auto" w:fill="F2F5F8"/>
+          </w:tcPr>
+          <w:p>
+            <w:r>
+              <w:rPr>
+                <w:b w:val="0"/>
+                <w:color w:val="1A5F8A"/>
+                <w:sz w:val="15"/>
+              </w:rPr>
+              <w:t>I40</w:t>
+            </w:r>
+          </w:p>
+        </w:tc>
+        <w:tc>
+          <w:tcPr>
+            <w:tcW w:type="dxa" w:w="1904"/>
+            <w:shd w:val="clear" w:color="auto" w:fill="F2F5F8"/>
+          </w:tcPr>
+          <w:p>
+            <w:r>
+              <w:rPr>
+                <w:b w:val="0"/>
+                <w:sz w:val="15"/>
+              </w:rPr>
+              <w:t>Product Designer</w:t>
+            </w:r>
+          </w:p>
+        </w:tc>
+      </w:tr>
+      <w:tr>
+        <w:tc>
+          <w:tcPr>
+            <w:tcW w:type="dxa" w:w="1904"/>
+            <w:shd w:val="clear" w:color="auto" w:fill="FFFFFF"/>
+          </w:tcPr>
+          <w:p>
+            <w:r>
+              <w:rPr>
+                <w:b/>
+                <w:color w:val="0D2B4A"/>
+                <w:sz w:val="16"/>
+              </w:rPr>
+              <w:t>TOTAL</w:t>
+            </w:r>
+          </w:p>
+        </w:tc>
+        <w:tc>
+          <w:tcPr>
+            <w:tcW w:type="dxa" w:w="1904"/>
+            <w:shd w:val="clear" w:color="auto" w:fill="FFFFFF"/>
+          </w:tcPr>
+          <w:p>
+            <w:pPr>
+              <w:jc w:val="center"/>
+            </w:pPr>
+            <w:r>
+              <w:rPr>
+                <w:b/>
+                <w:color w:val="0D2B4A"/>
+                <w:sz w:val="16"/>
+              </w:rPr>
+              <w:t>44</w:t>
+            </w:r>
+          </w:p>
+        </w:tc>
+        <w:tc>
+          <w:tcPr>
+            <w:tcW w:type="dxa" w:w="1904"/>
+            <w:shd w:val="clear" w:color="auto" w:fill="FFFFFF"/>
+          </w:tcPr>
+          <w:p>
+            <w:pPr>
+              <w:jc w:val="center"/>
+            </w:pPr>
+            <w:r>
+              <w:rPr>
+                <w:b/>
+                <w:color w:val="0D2B4A"/>
+                <w:sz w:val="16"/>
+              </w:rPr>
+              <w:t>100.0%</w:t>
+            </w:r>
+          </w:p>
+        </w:tc>
+        <w:tc>
+          <w:tcPr>
+            <w:tcW w:type="dxa" w:w="1904"/>
+            <w:shd w:val="clear" w:color="auto" w:fill="FFFFFF"/>
+          </w:tcPr>
+          <w:p>
+            <w:r>
+              <w:rPr>
+                <w:b w:val="0"/>
+                <w:color w:val="1A5F8A"/>
+                <w:sz w:val="15"/>
+              </w:rPr>
+              <w:t>—</w:t>
+            </w:r>
+          </w:p>
+        </w:tc>
+        <w:tc>
+          <w:tcPr>
+            <w:tcW w:type="dxa" w:w="1904"/>
+            <w:shd w:val="clear" w:color="auto" w:fill="FFFFFF"/>
+          </w:tcPr>
+          <w:p>
+            <w:r>
+              <w:rPr>
+                <w:b w:val="0"/>
+                <w:sz w:val="15"/>
+              </w:rPr>
+            </w:r>
+          </w:p>
+        </w:tc>
+      </w:tr>
+    </w:tbl>
+    <w:p>
+      <w:pPr>
+        <w:spacing w:before="0" w:after="100"/>
+      </w:pPr>
+    </w:p>
+    <w:p>
+      <w:pPr>
+        <w:spacing w:before="0" w:after="40"/>
+      </w:pPr>
+      <w:r>
+        <w:rPr>
+          <w:b w:val="0"/>
+          <w:color w:val="808090"/>
+          <w:sz w:val="15"/>
+        </w:rPr>
+        <w:t>Note on anonymization: All interviewees consented to participation in LoopForgeLab's research. No names, company names, or identifying details are disclosed. Codes I1–I44 are used exclusively for internal cross-referencing between this report and the White Paper appendix. Role descriptions are generalized where specificity could compromise anonymity.</w:t>
       </w:r>
     </w:p>
     <w:sectPr>

</xml_diff>